<commit_message>
Development project - Methodology
</commit_message>
<xml_diff>
--- a/development/docs/methodology/Development_Economics_Project_Pipeline_Methodology.docx
+++ b/development/docs/methodology/Development_Economics_Project_Pipeline_Methodology.docx
@@ -8,6 +8,7 @@
         <w:spacing w:after="0"/>
         <w:jc w:val="center"/>
         <w:rPr>
+          <w:rFonts w:ascii="Calibri" w:hAnsi="Calibri" w:cs="Calibri"/>
           <w:b/>
           <w:bCs/>
           <w:sz w:val="40"/>
@@ -16,6 +17,7 @@
       </w:pPr>
       <w:r>
         <w:rPr>
+          <w:rFonts w:ascii="Calibri" w:hAnsi="Calibri" w:cs="Calibri"/>
           <w:b/>
           <w:bCs/>
           <w:sz w:val="40"/>
@@ -29,17 +31,32 @@
         <w:pStyle w:val="Subtitle"/>
         <w:spacing w:after="0"/>
         <w:jc w:val="center"/>
+        <w:rPr>
+          <w:rFonts w:ascii="Calibri" w:hAnsi="Calibri" w:cs="Calibri"/>
+        </w:rPr>
       </w:pPr>
       <w:r>
+        <w:rPr>
+          <w:rFonts w:ascii="Calibri" w:hAnsi="Calibri" w:cs="Calibri"/>
+        </w:rPr>
         <w:t xml:space="preserve">Econometric structure, model </w:t>
       </w:r>
       <w:r>
+        <w:rPr>
+          <w:rFonts w:ascii="Calibri" w:hAnsi="Calibri" w:cs="Calibri"/>
+        </w:rPr>
         <w:t>design</w:t>
       </w:r>
       <w:r>
+        <w:rPr>
+          <w:rFonts w:ascii="Calibri" w:hAnsi="Calibri" w:cs="Calibri"/>
+        </w:rPr>
         <w:t>, robustness</w:t>
       </w:r>
       <w:r>
+        <w:rPr>
+          <w:rFonts w:ascii="Calibri" w:hAnsi="Calibri" w:cs="Calibri"/>
+        </w:rPr>
         <w:t>, empirical pipeline</w:t>
       </w:r>
     </w:p>
@@ -55,7 +72,21 @@
           <w:rFonts w:ascii="Calibri" w:hAnsi="Calibri" w:cs="Calibri"/>
           <w:color w:val="203864"/>
         </w:rPr>
-        <w:t>1. Conceptual roadmap</w:t>
+        <w:t xml:space="preserve">1. Conceptual </w:t>
+      </w:r>
+      <w:r>
+        <w:rPr>
+          <w:rFonts w:ascii="Calibri" w:hAnsi="Calibri" w:cs="Calibri"/>
+          <w:color w:val="203864"/>
+        </w:rPr>
+        <w:t>R</w:t>
+      </w:r>
+      <w:r>
+        <w:rPr>
+          <w:rFonts w:ascii="Calibri" w:hAnsi="Calibri" w:cs="Calibri"/>
+          <w:color w:val="203864"/>
+        </w:rPr>
+        <w:t>oadmap</w:t>
       </w:r>
     </w:p>
     <w:p>
@@ -202,7 +233,27 @@
                 <w:sz w:val="23"/>
                 <w:szCs w:val="23"/>
               </w:rPr>
-              <w:t>Analytical purpose</w:t>
+              <w:t xml:space="preserve">Analytical </w:t>
+            </w:r>
+            <w:r>
+              <w:rPr>
+                <w:rFonts w:ascii="Calibri" w:hAnsi="Calibri" w:cs="Calibri"/>
+                <w:b/>
+                <w:color w:val="203864"/>
+                <w:sz w:val="23"/>
+                <w:szCs w:val="23"/>
+              </w:rPr>
+              <w:t>P</w:t>
+            </w:r>
+            <w:r>
+              <w:rPr>
+                <w:rFonts w:ascii="Calibri" w:hAnsi="Calibri" w:cs="Calibri"/>
+                <w:b/>
+                <w:color w:val="203864"/>
+                <w:sz w:val="23"/>
+                <w:szCs w:val="23"/>
+              </w:rPr>
+              <w:t>urpose</w:t>
             </w:r>
           </w:p>
         </w:tc>
@@ -263,7 +314,6 @@
               <w:rPr>
                 <w:rFonts w:ascii="Calibri" w:hAnsi="Calibri" w:cs="Calibri"/>
                 <w:szCs w:val="21"/>
-                <w:highlight w:val="yellow"/>
               </w:rPr>
               <w:t>Load</w:t>
             </w:r>
@@ -271,7 +321,6 @@
               <w:rPr>
                 <w:rFonts w:ascii="Calibri" w:hAnsi="Calibri" w:cs="Calibri"/>
                 <w:szCs w:val="21"/>
-                <w:highlight w:val="yellow"/>
               </w:rPr>
               <w:t>ing a</w:t>
             </w:r>
@@ -279,7 +328,6 @@
               <w:rPr>
                 <w:rFonts w:ascii="Calibri" w:hAnsi="Calibri" w:cs="Calibri"/>
                 <w:szCs w:val="21"/>
-                <w:highlight w:val="yellow"/>
               </w:rPr>
               <w:t>nd Inspect</w:t>
             </w:r>
@@ -287,7 +335,6 @@
               <w:rPr>
                 <w:rFonts w:ascii="Calibri" w:hAnsi="Calibri" w:cs="Calibri"/>
                 <w:szCs w:val="21"/>
-                <w:highlight w:val="yellow"/>
               </w:rPr>
               <w:t>ing</w:t>
             </w:r>
@@ -295,7 +342,6 @@
               <w:rPr>
                 <w:rFonts w:ascii="Calibri" w:hAnsi="Calibri" w:cs="Calibri"/>
                 <w:szCs w:val="21"/>
-                <w:highlight w:val="yellow"/>
               </w:rPr>
               <w:t xml:space="preserve"> the Dataset</w:t>
             </w:r>
@@ -324,16 +370,8 @@
               <w:rPr>
                 <w:rFonts w:ascii="Calibri" w:hAnsi="Calibri" w:cs="Calibri"/>
                 <w:szCs w:val="21"/>
-                <w:highlight w:val="yellow"/>
-              </w:rPr>
-              <w:t>Verify</w:t>
-            </w:r>
-            <w:r>
-              <w:rPr>
-                <w:rFonts w:ascii="Calibri" w:hAnsi="Calibri" w:cs="Calibri"/>
-                <w:szCs w:val="21"/>
-              </w:rPr>
-              <w:t xml:space="preserve"> that the import, variable types, missing values, and naming are correct.</w:t>
+              </w:rPr>
+              <w:t>The import process, variable types, missing values, and naming conventions are verified.</w:t>
             </w:r>
           </w:p>
         </w:tc>
@@ -394,7 +432,6 @@
               <w:rPr>
                 <w:rFonts w:ascii="Calibri" w:hAnsi="Calibri" w:cs="Calibri"/>
                 <w:szCs w:val="21"/>
-                <w:highlight w:val="yellow"/>
               </w:rPr>
               <w:t>Prepar</w:t>
             </w:r>
@@ -402,7 +439,6 @@
               <w:rPr>
                 <w:rFonts w:ascii="Calibri" w:hAnsi="Calibri" w:cs="Calibri"/>
                 <w:szCs w:val="21"/>
-                <w:highlight w:val="yellow"/>
               </w:rPr>
               <w:t xml:space="preserve">ing </w:t>
             </w:r>
@@ -410,7 +446,6 @@
               <w:rPr>
                 <w:rFonts w:ascii="Calibri" w:hAnsi="Calibri" w:cs="Calibri"/>
                 <w:szCs w:val="21"/>
-                <w:highlight w:val="yellow"/>
               </w:rPr>
               <w:t>Variables and Metadata</w:t>
             </w:r>
@@ -439,16 +474,15 @@
               <w:rPr>
                 <w:rFonts w:ascii="Calibri" w:hAnsi="Calibri" w:cs="Calibri"/>
                 <w:szCs w:val="21"/>
-                <w:highlight w:val="yellow"/>
-              </w:rPr>
-              <w:t>Rename</w:t>
-            </w:r>
-            <w:r>
-              <w:rPr>
-                <w:rFonts w:ascii="Calibri" w:hAnsi="Calibri" w:cs="Calibri"/>
-                <w:szCs w:val="21"/>
-              </w:rPr>
-              <w:t xml:space="preserve"> the columns and create numeric subsets and clustering vectors for region, institutional stability, and core growth model.</w:t>
+              </w:rPr>
+              <w:t>Columns are renamed and numeric subsets are constructed, together with clustering variables for region, institutional stability, and core growth model</w:t>
+            </w:r>
+            <w:r>
+              <w:rPr>
+                <w:rFonts w:ascii="Calibri" w:hAnsi="Calibri" w:cs="Calibri"/>
+                <w:szCs w:val="21"/>
+              </w:rPr>
+              <w:t>.</w:t>
             </w:r>
           </w:p>
         </w:tc>
@@ -537,16 +571,8 @@
               <w:rPr>
                 <w:rFonts w:ascii="Calibri" w:hAnsi="Calibri" w:cs="Calibri"/>
                 <w:szCs w:val="21"/>
-                <w:highlight w:val="yellow"/>
-              </w:rPr>
-              <w:t xml:space="preserve">Explore </w:t>
-            </w:r>
-            <w:r>
-              <w:rPr>
-                <w:rFonts w:ascii="Calibri" w:hAnsi="Calibri" w:cs="Calibri"/>
-                <w:szCs w:val="21"/>
-              </w:rPr>
-              <w:t>the linear associations among variables and select the most informative relationships for scatter plots.</w:t>
+              </w:rPr>
+              <w:t>Linear associations among variables are explored in order to identify the most informative relationships for subsequent graphical analysis.</w:t>
             </w:r>
           </w:p>
         </w:tc>
@@ -635,16 +661,8 @@
               <w:rPr>
                 <w:rFonts w:ascii="Calibri" w:hAnsi="Calibri" w:cs="Calibri"/>
                 <w:szCs w:val="21"/>
-                <w:highlight w:val="yellow"/>
-              </w:rPr>
-              <w:t>Check</w:t>
-            </w:r>
-            <w:r>
-              <w:rPr>
-                <w:rFonts w:ascii="Calibri" w:hAnsi="Calibri" w:cs="Calibri"/>
-                <w:szCs w:val="21"/>
-              </w:rPr>
-              <w:t xml:space="preserve"> the shape of relationships, clusters, outliers, and leverage cases using country code as the label.</w:t>
+              </w:rPr>
+              <w:t>The shape of relationships, cluster structures, outliers, and leverage points are examined using country codes as labels.</w:t>
             </w:r>
           </w:p>
         </w:tc>
@@ -733,16 +751,8 @@
               <w:rPr>
                 <w:rFonts w:ascii="Calibri" w:hAnsi="Calibri" w:cs="Calibri"/>
                 <w:szCs w:val="21"/>
-                <w:highlight w:val="yellow"/>
-              </w:rPr>
-              <w:t xml:space="preserve">Estimate </w:t>
-            </w:r>
-            <w:r>
-              <w:rPr>
-                <w:rFonts w:ascii="Calibri" w:hAnsi="Calibri" w:cs="Calibri"/>
-                <w:szCs w:val="21"/>
-              </w:rPr>
-              <w:t>the models for the level of GDP per capita according to the agreed specifications.</w:t>
+              </w:rPr>
+              <w:t>Regression models for the level of GDP per capita are estimated according to the specified empirical framework.</w:t>
             </w:r>
           </w:p>
         </w:tc>
@@ -831,16 +841,8 @@
               <w:rPr>
                 <w:rFonts w:ascii="Calibri" w:hAnsi="Calibri" w:cs="Calibri"/>
                 <w:szCs w:val="21"/>
-                <w:highlight w:val="yellow"/>
-              </w:rPr>
-              <w:t>Repeat</w:t>
-            </w:r>
-            <w:r>
-              <w:rPr>
-                <w:rFonts w:ascii="Calibri" w:hAnsi="Calibri" w:cs="Calibri"/>
-                <w:szCs w:val="21"/>
-              </w:rPr>
-              <w:t xml:space="preserve"> the process for Model 2 using only the baseline model for GDP per capita growth.</w:t>
+              </w:rPr>
+              <w:t>The same procedure is applied to Model 2, focusing on the baseline specification for GDP per capita growth.</w:t>
             </w:r>
           </w:p>
         </w:tc>
@@ -929,16 +931,8 @@
               <w:rPr>
                 <w:rFonts w:ascii="Calibri" w:hAnsi="Calibri" w:cs="Calibri"/>
                 <w:szCs w:val="21"/>
-                <w:highlight w:val="yellow"/>
-              </w:rPr>
-              <w:t xml:space="preserve">Assess </w:t>
-            </w:r>
-            <w:r>
-              <w:rPr>
-                <w:rFonts w:ascii="Calibri" w:hAnsi="Calibri" w:cs="Calibri"/>
-                <w:szCs w:val="21"/>
-              </w:rPr>
-              <w:t>the robustness of the results with respect to specifications, sample, outliers, and standardization.</w:t>
+              </w:rPr>
+              <w:t>Robustness is assessed with respect to model specification, sample composition, outliers, and standardization.</w:t>
             </w:r>
           </w:p>
         </w:tc>
@@ -1026,7 +1020,6 @@
           <w:tab w:val="left" w:pos="2127"/>
         </w:tabs>
         <w:spacing w:after="0"/>
-        <w:ind w:left="360"/>
         <w:rPr>
           <w:rFonts w:ascii="Calibri" w:hAnsi="Calibri" w:cs="Calibri"/>
         </w:rPr>
@@ -1034,40 +1027,6 @@
     </w:p>
     <w:p>
       <w:pPr>
-        <w:pStyle w:val="ListBullet"/>
-        <w:numPr>
-          <w:ilvl w:val="0"/>
-          <w:numId w:val="0"/>
-        </w:numPr>
-        <w:tabs>
-          <w:tab w:val="left" w:pos="2127"/>
-        </w:tabs>
-        <w:spacing w:after="0"/>
-        <w:ind w:left="360"/>
-        <w:rPr>
-          <w:rFonts w:ascii="Calibri" w:hAnsi="Calibri" w:cs="Calibri"/>
-        </w:rPr>
-      </w:pPr>
-    </w:p>
-    <w:p>
-      <w:pPr>
-        <w:pStyle w:val="ListBullet"/>
-        <w:numPr>
-          <w:ilvl w:val="0"/>
-          <w:numId w:val="0"/>
-        </w:numPr>
-        <w:tabs>
-          <w:tab w:val="left" w:pos="2127"/>
-        </w:tabs>
-        <w:spacing w:after="0"/>
-        <w:ind w:left="360"/>
-        <w:rPr>
-          <w:rFonts w:ascii="Calibri" w:hAnsi="Calibri" w:cs="Calibri"/>
-        </w:rPr>
-      </w:pPr>
-    </w:p>
-    <w:p>
-      <w:pPr>
         <w:pStyle w:val="Heading1"/>
         <w:spacing w:before="0"/>
         <w:rPr>
@@ -1080,6 +1039,7 @@
           <w:rFonts w:ascii="Calibri" w:hAnsi="Calibri" w:cs="Calibri"/>
           <w:color w:val="203864"/>
         </w:rPr>
+        <w:lastRenderedPageBreak/>
         <w:t xml:space="preserve">3. Variable </w:t>
       </w:r>
       <w:r>
@@ -1106,7 +1066,9 @@
     </w:p>
     <w:p>
       <w:pPr>
-        <w:spacing w:after="0"/>
+        <w:rPr>
+          <w:rFonts w:ascii="Calibri" w:hAnsi="Calibri" w:cs="Calibri"/>
+        </w:rPr>
       </w:pPr>
     </w:p>
     <w:p>
@@ -1127,7 +1089,6 @@
           <w:sz w:val="25"/>
           <w:szCs w:val="25"/>
         </w:rPr>
-        <w:lastRenderedPageBreak/>
         <w:t>Dependent Variables</w:t>
       </w:r>
       <w:r>
@@ -1288,16 +1249,7 @@
           <w:sz w:val="25"/>
           <w:szCs w:val="25"/>
         </w:rPr>
-        <w:t>Control Variables</w:t>
-      </w:r>
-      <w:r>
-        <w:rPr>
-          <w:rFonts w:ascii="Calibri" w:hAnsi="Calibri" w:cs="Calibri"/>
-          <w:color w:val="2F5597"/>
-          <w:sz w:val="25"/>
-          <w:szCs w:val="25"/>
-        </w:rPr>
-        <w:t xml:space="preserve"> by Model</w:t>
+        <w:t>Control Variables by Model</w:t>
       </w:r>
     </w:p>
     <w:p>
@@ -1330,43 +1282,10 @@
         </w:rPr>
       </w:pPr>
       <w:r>
-        <w:t>HCI+ score</w:t>
-      </w:r>
-      <w:r>
-        <w:rPr>
-          <w:rFonts w:ascii="Calibri" w:hAnsi="Calibri" w:cs="Calibri"/>
-        </w:rPr>
-        <w:t xml:space="preserve">: </w:t>
-      </w:r>
-      <w:r>
-        <w:rPr>
-          <w:rFonts w:ascii="Calibri" w:hAnsi="Calibri" w:cs="Calibri"/>
-        </w:rPr>
-        <w:t xml:space="preserve">11 </w:t>
-      </w:r>
-      <w:r>
-        <w:rPr>
-          <w:rFonts w:ascii="Calibri" w:hAnsi="Calibri" w:cs="Calibri"/>
-        </w:rPr>
-        <w:t>indicators</w:t>
-      </w:r>
-      <w:r>
-        <w:rPr>
-          <w:rFonts w:ascii="Calibri" w:hAnsi="Calibri" w:cs="Calibri"/>
-        </w:rPr>
-        <w:t xml:space="preserve"> focused on health, education, and employment</w:t>
-      </w:r>
-      <w:r>
-        <w:rPr>
-          <w:rFonts w:ascii="Calibri" w:hAnsi="Calibri" w:cs="Calibri"/>
-        </w:rPr>
-        <w:t xml:space="preserve"> </w:t>
-      </w:r>
-      <w:r>
-        <w:rPr>
-          <w:rFonts w:ascii="Calibri" w:hAnsi="Calibri" w:cs="Calibri"/>
-        </w:rPr>
-        <w:t>(2023 or latest available year)</w:t>
+        <w:rPr>
+          <w:rFonts w:ascii="Calibri" w:hAnsi="Calibri" w:cs="Calibri"/>
+        </w:rPr>
+        <w:t>HCI+ score: 11 indicators focused on health, education, and employment (2023 or latest available year)</w:t>
       </w:r>
     </w:p>
     <w:p>
@@ -1388,55 +1307,13 @@
         <w:rPr>
           <w:rFonts w:ascii="Calibri" w:hAnsi="Calibri" w:cs="Calibri"/>
         </w:rPr>
-        <w:t xml:space="preserve">Institution </w:t>
+        <w:t>Governance</w:t>
       </w:r>
       <w:r>
         <w:rPr>
           <w:rFonts w:ascii="Calibri" w:hAnsi="Calibri" w:cs="Calibri"/>
         </w:rPr>
-        <w:t>s</w:t>
-      </w:r>
-      <w:r>
-        <w:rPr>
-          <w:rFonts w:ascii="Calibri" w:hAnsi="Calibri" w:cs="Calibri"/>
-        </w:rPr>
-        <w:t>core</w:t>
-      </w:r>
-      <w:r>
-        <w:rPr>
-          <w:rFonts w:ascii="Calibri" w:hAnsi="Calibri" w:cs="Calibri"/>
-        </w:rPr>
-        <w:t xml:space="preserve">: average </w:t>
-      </w:r>
-      <w:r>
-        <w:rPr>
-          <w:rFonts w:ascii="Calibri" w:hAnsi="Calibri" w:cs="Calibri"/>
-        </w:rPr>
-        <w:t>of</w:t>
-      </w:r>
-      <w:r>
-        <w:rPr>
-          <w:rFonts w:ascii="Calibri" w:hAnsi="Calibri" w:cs="Calibri"/>
-        </w:rPr>
-        <w:t xml:space="preserve"> </w:t>
-      </w:r>
-      <w:r>
-        <w:rPr>
-          <w:rFonts w:ascii="Calibri" w:hAnsi="Calibri" w:cs="Calibri"/>
-        </w:rPr>
-        <w:t>Rule of Law, Government Effectiveness, Control of Corruption, Political Stability, Voice and Accountability, Regulatory Quality</w:t>
-      </w:r>
-      <w:r>
-        <w:rPr>
-          <w:rFonts w:ascii="Calibri" w:hAnsi="Calibri" w:cs="Calibri"/>
-        </w:rPr>
-        <w:t xml:space="preserve"> </w:t>
-      </w:r>
-      <w:r>
-        <w:rPr>
-          <w:rFonts w:ascii="Calibri" w:hAnsi="Calibri" w:cs="Calibri"/>
-        </w:rPr>
-        <w:t>(2023 or latest available year)</w:t>
+        <w:t xml:space="preserve"> score: average of Rule of Law, Government Effectiveness, Control of Corruption, Political Stability, Voice and Accountability, Regulatory Quality (2023 or latest available year)</w:t>
       </w:r>
     </w:p>
     <w:p>
@@ -1458,31 +1335,7 @@
         <w:rPr>
           <w:rFonts w:ascii="Calibri" w:hAnsi="Calibri" w:cs="Calibri"/>
         </w:rPr>
-        <w:t>Accumulation &amp; Openness</w:t>
-      </w:r>
-      <w:r>
-        <w:rPr>
-          <w:rFonts w:ascii="Calibri" w:hAnsi="Calibri" w:cs="Calibri"/>
-        </w:rPr>
-        <w:t xml:space="preserve">: </w:t>
-      </w:r>
-      <w:r>
-        <w:rPr>
-          <w:rFonts w:ascii="Calibri" w:hAnsi="Calibri" w:cs="Calibri"/>
-        </w:rPr>
-        <w:t>Gross capital formation (% of GDP); Trade openness (% of GDP); FDI inflows (% of GDP)</w:t>
-      </w:r>
-      <w:r>
-        <w:rPr>
-          <w:rFonts w:ascii="Calibri" w:hAnsi="Calibri" w:cs="Calibri"/>
-        </w:rPr>
-        <w:t xml:space="preserve"> </w:t>
-      </w:r>
-      <w:r>
-        <w:rPr>
-          <w:rFonts w:ascii="Calibri" w:hAnsi="Calibri" w:cs="Calibri"/>
-        </w:rPr>
-        <w:t>(2023 or latest available year)</w:t>
+        <w:t>Accumulation &amp; Openness: Gross capital formation (% of GDP); Trade openness (% of GDP); FDI inflows (% of GDP) (2023 or latest available year)</w:t>
       </w:r>
     </w:p>
     <w:p>
@@ -1504,31 +1357,7 @@
         <w:rPr>
           <w:rFonts w:ascii="Calibri" w:hAnsi="Calibri" w:cs="Calibri"/>
         </w:rPr>
-        <w:t>Structure &amp; Resources</w:t>
-      </w:r>
-      <w:r>
-        <w:rPr>
-          <w:rFonts w:ascii="Calibri" w:hAnsi="Calibri" w:cs="Calibri"/>
-        </w:rPr>
-        <w:t xml:space="preserve">: </w:t>
-      </w:r>
-      <w:r>
-        <w:rPr>
-          <w:rFonts w:ascii="Calibri" w:hAnsi="Calibri" w:cs="Calibri"/>
-        </w:rPr>
-        <w:t>Manufacturing value added (% of GDP); Services value added (% of GDP); Natural rents (% of GDP)</w:t>
-      </w:r>
-      <w:r>
-        <w:rPr>
-          <w:rFonts w:ascii="Calibri" w:hAnsi="Calibri" w:cs="Calibri"/>
-        </w:rPr>
-        <w:t xml:space="preserve"> </w:t>
-      </w:r>
-      <w:r>
-        <w:rPr>
-          <w:rFonts w:ascii="Calibri" w:hAnsi="Calibri" w:cs="Calibri"/>
-        </w:rPr>
-        <w:t>(2023 or latest available year)</w:t>
+        <w:t>Structure &amp; Resources: Manufacturing value added (% of GDP); Services value added (% of GDP); Natural rents (% of GDP) (2023 or latest available year)</w:t>
       </w:r>
     </w:p>
     <w:p>
@@ -1576,67 +1405,10 @@
         </w:rPr>
       </w:pPr>
       <w:r>
-        <w:t>HCI+ score average</w:t>
-      </w:r>
-      <w:r>
-        <w:rPr>
-          <w:rFonts w:ascii="Calibri" w:hAnsi="Calibri" w:cs="Calibri"/>
-        </w:rPr>
-        <w:t xml:space="preserve">: </w:t>
-      </w:r>
-      <w:r>
-        <w:rPr>
-          <w:rFonts w:ascii="Calibri" w:hAnsi="Calibri" w:cs="Calibri"/>
-        </w:rPr>
-        <w:t xml:space="preserve">11 </w:t>
-      </w:r>
-      <w:r>
-        <w:rPr>
-          <w:rFonts w:ascii="Calibri" w:hAnsi="Calibri" w:cs="Calibri"/>
-        </w:rPr>
-        <w:t>indicators</w:t>
-      </w:r>
-      <w:r>
-        <w:rPr>
-          <w:rFonts w:ascii="Calibri" w:hAnsi="Calibri" w:cs="Calibri"/>
-        </w:rPr>
-        <w:t xml:space="preserve"> focused on health, education, and employment</w:t>
-      </w:r>
-      <w:r>
-        <w:rPr>
-          <w:rFonts w:ascii="Calibri" w:hAnsi="Calibri" w:cs="Calibri"/>
-        </w:rPr>
-        <w:t xml:space="preserve"> </w:t>
-      </w:r>
-      <w:r>
-        <w:rPr>
-          <w:rFonts w:ascii="Calibri" w:hAnsi="Calibri" w:cs="Calibri"/>
-        </w:rPr>
-        <w:t>(20</w:t>
-      </w:r>
-      <w:r>
-        <w:rPr>
-          <w:rFonts w:ascii="Calibri" w:hAnsi="Calibri" w:cs="Calibri"/>
-        </w:rPr>
-        <w:t>00-2023</w:t>
-      </w:r>
-      <w:r>
-        <w:rPr>
-          <w:rFonts w:ascii="Calibri" w:hAnsi="Calibri" w:cs="Calibri"/>
-        </w:rPr>
-        <w:t xml:space="preserve"> or latest available </w:t>
-      </w:r>
-      <w:r>
-        <w:rPr>
-          <w:rFonts w:ascii="Calibri" w:hAnsi="Calibri" w:cs="Calibri"/>
-        </w:rPr>
-        <w:t>period</w:t>
-      </w:r>
-      <w:r>
-        <w:rPr>
-          <w:rFonts w:ascii="Calibri" w:hAnsi="Calibri" w:cs="Calibri"/>
-        </w:rPr>
-        <w:t>)</w:t>
+        <w:rPr>
+          <w:rFonts w:ascii="Calibri" w:hAnsi="Calibri" w:cs="Calibri"/>
+        </w:rPr>
+        <w:t>HCI+ score average: 11 indicators focused on health, education, and employment (2000-2023 or latest available period)</w:t>
       </w:r>
     </w:p>
     <w:p>
@@ -1658,79 +1430,13 @@
         <w:rPr>
           <w:rFonts w:ascii="Calibri" w:hAnsi="Calibri" w:cs="Calibri"/>
         </w:rPr>
-        <w:t xml:space="preserve">Institution </w:t>
+        <w:t>Governance</w:t>
       </w:r>
       <w:r>
         <w:rPr>
           <w:rFonts w:ascii="Calibri" w:hAnsi="Calibri" w:cs="Calibri"/>
         </w:rPr>
-        <w:t>s</w:t>
-      </w:r>
-      <w:r>
-        <w:rPr>
-          <w:rFonts w:ascii="Calibri" w:hAnsi="Calibri" w:cs="Calibri"/>
-        </w:rPr>
-        <w:t>core</w:t>
-      </w:r>
-      <w:r>
-        <w:rPr>
-          <w:rFonts w:ascii="Calibri" w:hAnsi="Calibri" w:cs="Calibri"/>
-        </w:rPr>
-        <w:t xml:space="preserve"> average: average </w:t>
-      </w:r>
-      <w:r>
-        <w:rPr>
-          <w:rFonts w:ascii="Calibri" w:hAnsi="Calibri" w:cs="Calibri"/>
-        </w:rPr>
-        <w:t>of</w:t>
-      </w:r>
-      <w:r>
-        <w:rPr>
-          <w:rFonts w:ascii="Calibri" w:hAnsi="Calibri" w:cs="Calibri"/>
-        </w:rPr>
-        <w:t xml:space="preserve"> </w:t>
-      </w:r>
-      <w:r>
-        <w:rPr>
-          <w:rFonts w:ascii="Calibri" w:hAnsi="Calibri" w:cs="Calibri"/>
-        </w:rPr>
-        <w:t>Rule of Law, Government Effectiveness, Control of Corruption, Political Stability, Voice and Accountability, Regulatory Quality</w:t>
-      </w:r>
-      <w:r>
-        <w:rPr>
-          <w:rFonts w:ascii="Calibri" w:hAnsi="Calibri" w:cs="Calibri"/>
-        </w:rPr>
-        <w:t xml:space="preserve"> </w:t>
-      </w:r>
-      <w:r>
-        <w:rPr>
-          <w:rFonts w:ascii="Calibri" w:hAnsi="Calibri" w:cs="Calibri"/>
-        </w:rPr>
-        <w:t>(20</w:t>
-      </w:r>
-      <w:r>
-        <w:rPr>
-          <w:rFonts w:ascii="Calibri" w:hAnsi="Calibri" w:cs="Calibri"/>
-        </w:rPr>
-        <w:t>00-2023</w:t>
-      </w:r>
-      <w:r>
-        <w:rPr>
-          <w:rFonts w:ascii="Calibri" w:hAnsi="Calibri" w:cs="Calibri"/>
-        </w:rPr>
-        <w:t xml:space="preserve"> or latest available </w:t>
-      </w:r>
-      <w:r>
-        <w:rPr>
-          <w:rFonts w:ascii="Calibri" w:hAnsi="Calibri" w:cs="Calibri"/>
-        </w:rPr>
-        <w:t>period</w:t>
-      </w:r>
-      <w:r>
-        <w:rPr>
-          <w:rFonts w:ascii="Calibri" w:hAnsi="Calibri" w:cs="Calibri"/>
-        </w:rPr>
-        <w:t>)</w:t>
+        <w:t xml:space="preserve"> score average: average of Rule of Law, Government Effectiveness, Control of Corruption, Political Stability, Voice and Accountability, Regulatory Quality (2000-2023 or latest available period)</w:t>
       </w:r>
     </w:p>
     <w:p>
@@ -1752,55 +1458,7 @@
         <w:rPr>
           <w:rFonts w:ascii="Calibri" w:hAnsi="Calibri" w:cs="Calibri"/>
         </w:rPr>
-        <w:t>Accumulation &amp; Openness</w:t>
-      </w:r>
-      <w:r>
-        <w:rPr>
-          <w:rFonts w:ascii="Calibri" w:hAnsi="Calibri" w:cs="Calibri"/>
-        </w:rPr>
-        <w:t xml:space="preserve"> average: </w:t>
-      </w:r>
-      <w:r>
-        <w:rPr>
-          <w:rFonts w:ascii="Calibri" w:hAnsi="Calibri" w:cs="Calibri"/>
-        </w:rPr>
-        <w:t>Gross capital formation (% of GDP); Trade openness (% of GDP)</w:t>
-      </w:r>
-      <w:r>
-        <w:rPr>
-          <w:rFonts w:ascii="Calibri" w:hAnsi="Calibri" w:cs="Calibri"/>
-        </w:rPr>
-        <w:t xml:space="preserve"> </w:t>
-      </w:r>
-      <w:r>
-        <w:rPr>
-          <w:rFonts w:ascii="Calibri" w:hAnsi="Calibri" w:cs="Calibri"/>
-        </w:rPr>
-        <w:t>(20</w:t>
-      </w:r>
-      <w:r>
-        <w:rPr>
-          <w:rFonts w:ascii="Calibri" w:hAnsi="Calibri" w:cs="Calibri"/>
-        </w:rPr>
-        <w:t>00-2023</w:t>
-      </w:r>
-      <w:r>
-        <w:rPr>
-          <w:rFonts w:ascii="Calibri" w:hAnsi="Calibri" w:cs="Calibri"/>
-        </w:rPr>
-        <w:t xml:space="preserve"> or latest available </w:t>
-      </w:r>
-      <w:r>
-        <w:rPr>
-          <w:rFonts w:ascii="Calibri" w:hAnsi="Calibri" w:cs="Calibri"/>
-        </w:rPr>
-        <w:t>period</w:t>
-      </w:r>
-      <w:r>
-        <w:rPr>
-          <w:rFonts w:ascii="Calibri" w:hAnsi="Calibri" w:cs="Calibri"/>
-        </w:rPr>
-        <w:t>)</w:t>
+        <w:t>Accumulation &amp; Openness average: Gross capital formation (% of GDP); Trade openness (% of GDP) (2000-2023 or latest available period)</w:t>
       </w:r>
     </w:p>
     <w:p>
@@ -1835,17 +1493,6 @@
         </w:rPr>
         <w:t>Country Coverage</w:t>
       </w:r>
-    </w:p>
-    <w:p>
-      <w:pPr>
-        <w:tabs>
-          <w:tab w:val="left" w:pos="2127"/>
-        </w:tabs>
-        <w:spacing w:after="0"/>
-        <w:rPr>
-          <w:rFonts w:ascii="Calibri" w:hAnsi="Calibri" w:cs="Calibri"/>
-        </w:rPr>
-      </w:pPr>
     </w:p>
     <w:tbl>
       <w:tblPr>
@@ -2647,6 +2294,7 @@
                 <w:rFonts w:ascii="Calibri" w:hAnsi="Calibri" w:cs="Calibri"/>
                 <w:szCs w:val="21"/>
               </w:rPr>
+              <w:lastRenderedPageBreak/>
               <w:t>Central America</w:t>
             </w:r>
           </w:p>
@@ -2754,7 +2402,6 @@
                 <w:rFonts w:ascii="Calibri" w:hAnsi="Calibri" w:cs="Calibri"/>
                 <w:szCs w:val="21"/>
               </w:rPr>
-              <w:lastRenderedPageBreak/>
               <w:t>Guianas</w:t>
             </w:r>
           </w:p>
@@ -4346,6 +3993,9 @@
     <w:p>
       <w:pPr>
         <w:spacing w:after="0"/>
+        <w:rPr>
+          <w:rFonts w:ascii="Calibri" w:hAnsi="Calibri" w:cs="Calibri"/>
+        </w:rPr>
       </w:pPr>
     </w:p>
     <w:p>
@@ -4368,7 +4018,49 @@
           <w:rFonts w:ascii="Calibri" w:hAnsi="Calibri" w:cs="Calibri"/>
           <w:color w:val="203864"/>
         </w:rPr>
-        <w:t>. Model design and econometric logic</w:t>
+        <w:t xml:space="preserve">. Model </w:t>
+      </w:r>
+      <w:r>
+        <w:rPr>
+          <w:rFonts w:ascii="Calibri" w:hAnsi="Calibri" w:cs="Calibri"/>
+          <w:color w:val="203864"/>
+        </w:rPr>
+        <w:t>D</w:t>
+      </w:r>
+      <w:r>
+        <w:rPr>
+          <w:rFonts w:ascii="Calibri" w:hAnsi="Calibri" w:cs="Calibri"/>
+          <w:color w:val="203864"/>
+        </w:rPr>
+        <w:t xml:space="preserve">esign and </w:t>
+      </w:r>
+      <w:r>
+        <w:rPr>
+          <w:rFonts w:ascii="Calibri" w:hAnsi="Calibri" w:cs="Calibri"/>
+          <w:color w:val="203864"/>
+        </w:rPr>
+        <w:t>E</w:t>
+      </w:r>
+      <w:r>
+        <w:rPr>
+          <w:rFonts w:ascii="Calibri" w:hAnsi="Calibri" w:cs="Calibri"/>
+          <w:color w:val="203864"/>
+        </w:rPr>
+        <w:t xml:space="preserve">conometric </w:t>
+      </w:r>
+      <w:r>
+        <w:rPr>
+          <w:rFonts w:ascii="Calibri" w:hAnsi="Calibri" w:cs="Calibri"/>
+          <w:color w:val="203864"/>
+        </w:rPr>
+        <w:t>L</w:t>
+      </w:r>
+      <w:r>
+        <w:rPr>
+          <w:rFonts w:ascii="Calibri" w:hAnsi="Calibri" w:cs="Calibri"/>
+          <w:color w:val="203864"/>
+        </w:rPr>
+        <w:t>ogic</w:t>
       </w:r>
     </w:p>
     <w:p>
@@ -4482,7 +4174,21 @@
                 <w:rFonts w:ascii="Calibri" w:hAnsi="Calibri" w:cs="Calibri"/>
                 <w:szCs w:val="21"/>
               </w:rPr>
-              <w:t>Dependent variable: log GDP per capita. Regressors: governance index, HCI+ score, gross capital formation, trade openness.</w:t>
+              <w:t xml:space="preserve">Dependent variable: log GDP per capita. Regressors: governance </w:t>
+            </w:r>
+            <w:r>
+              <w:rPr>
+                <w:rFonts w:ascii="Calibri" w:hAnsi="Calibri" w:cs="Calibri"/>
+                <w:szCs w:val="21"/>
+              </w:rPr>
+              <w:t>score</w:t>
+            </w:r>
+            <w:r>
+              <w:rPr>
+                <w:rFonts w:ascii="Calibri" w:hAnsi="Calibri" w:cs="Calibri"/>
+                <w:szCs w:val="21"/>
+              </w:rPr>
+              <w:t>, HCI+ score, gross capital formation, trade openness.</w:t>
             </w:r>
           </w:p>
           <w:p>
@@ -4499,6 +4205,7 @@
                 <w:b/>
                 <w:szCs w:val="21"/>
               </w:rPr>
+              <w:lastRenderedPageBreak/>
               <w:t xml:space="preserve">Interpretation. </w:t>
             </w:r>
             <w:r>
@@ -4507,7 +4214,23 @@
                 <w:bCs/>
                 <w:szCs w:val="21"/>
               </w:rPr>
-              <w:t>Tests the joint role of institutions, human capital, accumulation, and trade openness as correlates of the level of development.</w:t>
+              <w:t xml:space="preserve">Tests the joint role of </w:t>
+            </w:r>
+            <w:r>
+              <w:rPr>
+                <w:rFonts w:ascii="Calibri" w:hAnsi="Calibri" w:cs="Calibri"/>
+                <w:bCs/>
+                <w:szCs w:val="21"/>
+              </w:rPr>
+              <w:t>governance</w:t>
+            </w:r>
+            <w:r>
+              <w:rPr>
+                <w:rFonts w:ascii="Calibri" w:hAnsi="Calibri" w:cs="Calibri"/>
+                <w:bCs/>
+                <w:szCs w:val="21"/>
+              </w:rPr>
+              <w:t>, human capital, accumulation, and trade openness as correlates of the level of development.</w:t>
             </w:r>
           </w:p>
           <w:p>
@@ -4525,10 +4248,27 @@
                 <w:tab w:val="left" w:pos="2127"/>
               </w:tabs>
               <w:spacing w:after="0" w:line="240" w:lineRule="auto"/>
+              <w:rPr>
+                <w:rFonts w:ascii="Calibri" w:hAnsi="Calibri" w:cs="Calibri"/>
+              </w:rPr>
             </w:pPr>
             <w:r>
-              <w:lastRenderedPageBreak/>
-              <w:t>log(GDPpc_i) = α + β1 Inst_i + β2 HC_i + β3 GCF_i + β4 Trade_i + ε_i</w:t>
+              <w:rPr>
+                <w:rFonts w:ascii="Calibri" w:hAnsi="Calibri" w:cs="Calibri"/>
+              </w:rPr>
+              <w:t xml:space="preserve">log(GDPpc_i) = α + β1 </w:t>
+            </w:r>
+            <w:r>
+              <w:rPr>
+                <w:rFonts w:ascii="Calibri" w:hAnsi="Calibri" w:cs="Calibri"/>
+              </w:rPr>
+              <w:t>Gov</w:t>
+            </w:r>
+            <w:r>
+              <w:rPr>
+                <w:rFonts w:ascii="Calibri" w:hAnsi="Calibri" w:cs="Calibri"/>
+              </w:rPr>
+              <w:t>_i + β2 HC_i + β3 GCF_i + β4 Trade_i + ε_i</w:t>
             </w:r>
           </w:p>
         </w:tc>
@@ -4654,7 +4394,23 @@
                 <w:bCs/>
                 <w:szCs w:val="21"/>
               </w:rPr>
-              <w:t>Assesses whether a higher manufacturing share is associated with the income level, conditional on institutions, human capital, investment, and trade.</w:t>
+              <w:t xml:space="preserve">Assesses whether a higher manufacturing share is associated with the income level, conditional on </w:t>
+            </w:r>
+            <w:r>
+              <w:rPr>
+                <w:rFonts w:ascii="Calibri" w:hAnsi="Calibri" w:cs="Calibri"/>
+                <w:bCs/>
+                <w:szCs w:val="21"/>
+              </w:rPr>
+              <w:t>governance</w:t>
+            </w:r>
+            <w:r>
+              <w:rPr>
+                <w:rFonts w:ascii="Calibri" w:hAnsi="Calibri" w:cs="Calibri"/>
+                <w:bCs/>
+                <w:szCs w:val="21"/>
+              </w:rPr>
+              <w:t>, human capital, investment, and trade.</w:t>
             </w:r>
           </w:p>
           <w:p>
@@ -4675,12 +4431,33 @@
               </w:rPr>
             </w:pPr>
             <w:r>
-              <w:t>log(GDPpc_i) = α + β1 Inst_i + β2 HC_i + β3 GCF_i + β4 Trade_i</w:t>
-            </w:r>
-            <w:r>
+              <w:rPr>
+                <w:rFonts w:ascii="Calibri" w:hAnsi="Calibri" w:cs="Calibri"/>
+              </w:rPr>
+              <w:t xml:space="preserve">log(GDPpc_i) = α + β1 </w:t>
+            </w:r>
+            <w:r>
+              <w:rPr>
+                <w:rFonts w:ascii="Calibri" w:hAnsi="Calibri" w:cs="Calibri"/>
+              </w:rPr>
+              <w:t>Gov</w:t>
+            </w:r>
+            <w:r>
+              <w:rPr>
+                <w:rFonts w:ascii="Calibri" w:hAnsi="Calibri" w:cs="Calibri"/>
+              </w:rPr>
+              <w:t>_i + β2 HC_i + β3 GCF_i + β4 Trade_i</w:t>
+            </w:r>
+            <w:r>
+              <w:rPr>
+                <w:rFonts w:ascii="Calibri" w:hAnsi="Calibri" w:cs="Calibri"/>
+              </w:rPr>
               <w:t xml:space="preserve"> </w:t>
             </w:r>
             <w:r>
+              <w:rPr>
+                <w:rFonts w:ascii="Calibri" w:hAnsi="Calibri" w:cs="Calibri"/>
+              </w:rPr>
               <w:t>+ β5 Manufacturing_i</w:t>
             </w:r>
             <w:r>
@@ -4691,6 +4468,9 @@
               <w:t xml:space="preserve"> </w:t>
             </w:r>
             <w:r>
+              <w:rPr>
+                <w:rFonts w:ascii="Calibri" w:hAnsi="Calibri" w:cs="Calibri"/>
+              </w:rPr>
               <w:t>+ ε_i</w:t>
             </w:r>
           </w:p>
@@ -4837,12 +4617,33 @@
               </w:rPr>
             </w:pPr>
             <w:r>
-              <w:t>log(GDPpc_i) = α + β1 Inst_</w:t>
-            </w:r>
-            <w:r>
+              <w:rPr>
+                <w:rFonts w:ascii="Calibri" w:hAnsi="Calibri" w:cs="Calibri"/>
+              </w:rPr>
+              <w:t xml:space="preserve">log(GDPpc_i) = α + β1 </w:t>
+            </w:r>
+            <w:r>
+              <w:rPr>
+                <w:rFonts w:ascii="Calibri" w:hAnsi="Calibri" w:cs="Calibri"/>
+              </w:rPr>
+              <w:t>Gov</w:t>
+            </w:r>
+            <w:r>
+              <w:rPr>
+                <w:rFonts w:ascii="Calibri" w:hAnsi="Calibri" w:cs="Calibri"/>
+              </w:rPr>
+              <w:t>_</w:t>
+            </w:r>
+            <w:r>
+              <w:rPr>
+                <w:rFonts w:ascii="Calibri" w:hAnsi="Calibri" w:cs="Calibri"/>
+              </w:rPr>
               <w:t>i</w:t>
             </w:r>
             <w:r>
+              <w:rPr>
+                <w:rFonts w:ascii="Calibri" w:hAnsi="Calibri" w:cs="Calibri"/>
+              </w:rPr>
               <w:t xml:space="preserve"> + β2 HC_i + β3 GCF_i + β4 Trade_i + β5 Services_i</w:t>
             </w:r>
             <w:r>
@@ -4853,6 +4654,9 @@
               <w:t xml:space="preserve"> </w:t>
             </w:r>
             <w:r>
+              <w:rPr>
+                <w:rFonts w:ascii="Calibri" w:hAnsi="Calibri" w:cs="Calibri"/>
+              </w:rPr>
               <w:t>+ ε_i</w:t>
             </w:r>
           </w:p>
@@ -4999,18 +4803,45 @@
               </w:rPr>
             </w:pPr>
             <w:r>
-              <w:t>log(GDPpc_i) = α + β1 Inst_i + β2 HC_i</w:t>
-            </w:r>
-            <w:r>
+              <w:rPr>
+                <w:rFonts w:ascii="Calibri" w:hAnsi="Calibri" w:cs="Calibri"/>
+              </w:rPr>
+              <w:t xml:space="preserve">log(GDPpc_i) = α + β1 </w:t>
+            </w:r>
+            <w:r>
+              <w:rPr>
+                <w:rFonts w:ascii="Calibri" w:hAnsi="Calibri" w:cs="Calibri"/>
+              </w:rPr>
+              <w:t>Gov</w:t>
+            </w:r>
+            <w:r>
+              <w:rPr>
+                <w:rFonts w:ascii="Calibri" w:hAnsi="Calibri" w:cs="Calibri"/>
+              </w:rPr>
+              <w:t>_i + β2 HC_i</w:t>
+            </w:r>
+            <w:r>
+              <w:rPr>
+                <w:rFonts w:ascii="Calibri" w:hAnsi="Calibri" w:cs="Calibri"/>
+              </w:rPr>
               <w:t xml:space="preserve"> </w:t>
             </w:r>
             <w:r>
+              <w:rPr>
+                <w:rFonts w:ascii="Calibri" w:hAnsi="Calibri" w:cs="Calibri"/>
+              </w:rPr>
               <w:t>+ β3 GCF_i</w:t>
             </w:r>
             <w:r>
+              <w:rPr>
+                <w:rFonts w:ascii="Calibri" w:hAnsi="Calibri" w:cs="Calibri"/>
+              </w:rPr>
               <w:t xml:space="preserve"> </w:t>
             </w:r>
             <w:r>
+              <w:rPr>
+                <w:rFonts w:ascii="Calibri" w:hAnsi="Calibri" w:cs="Calibri"/>
+              </w:rPr>
               <w:t>+ β4 Trade_i + β5 Manufacturing_i + β6 Services_i</w:t>
             </w:r>
             <w:r>
@@ -5021,6 +4852,9 @@
               <w:t xml:space="preserve"> </w:t>
             </w:r>
             <w:r>
+              <w:rPr>
+                <w:rFonts w:ascii="Calibri" w:hAnsi="Calibri" w:cs="Calibri"/>
+              </w:rPr>
               <w:t>+ ε_i</w:t>
             </w:r>
           </w:p>
@@ -5164,33 +4998,87 @@
                 <w:tab w:val="left" w:pos="2127"/>
               </w:tabs>
               <w:spacing w:after="0" w:line="240" w:lineRule="auto"/>
+              <w:rPr>
+                <w:rFonts w:ascii="Calibri" w:hAnsi="Calibri" w:cs="Calibri"/>
+              </w:rPr>
             </w:pPr>
             <w:r>
-              <w:t xml:space="preserve">log(GDPpc_i) = α + β1 Inst_i + </w:t>
-            </w:r>
-            <w:r>
+              <w:rPr>
+                <w:rFonts w:ascii="Calibri" w:hAnsi="Calibri" w:cs="Calibri"/>
+              </w:rPr>
+              <w:t xml:space="preserve">log(GDPpc_i) = α + β1 </w:t>
+            </w:r>
+            <w:r>
+              <w:rPr>
+                <w:rFonts w:ascii="Calibri" w:hAnsi="Calibri" w:cs="Calibri"/>
+              </w:rPr>
+              <w:t>Gov</w:t>
+            </w:r>
+            <w:r>
+              <w:rPr>
+                <w:rFonts w:ascii="Calibri" w:hAnsi="Calibri" w:cs="Calibri"/>
+              </w:rPr>
+              <w:t xml:space="preserve">_i + </w:t>
+            </w:r>
+            <w:r>
+              <w:rPr>
+                <w:rFonts w:ascii="Calibri" w:hAnsi="Calibri" w:cs="Calibri"/>
+              </w:rPr>
               <w:t xml:space="preserve">β2 HC_i + β3 GCF_i + β4 Trade_i + </w:t>
             </w:r>
             <w:r>
+              <w:rPr>
+                <w:rFonts w:ascii="Calibri" w:hAnsi="Calibri" w:cs="Calibri"/>
+              </w:rPr>
               <w:t>β</w:t>
             </w:r>
             <w:r>
+              <w:rPr>
+                <w:rFonts w:ascii="Calibri" w:hAnsi="Calibri" w:cs="Calibri"/>
+              </w:rPr>
               <w:t>5</w:t>
             </w:r>
             <w:r>
+              <w:rPr>
+                <w:rFonts w:ascii="Calibri" w:hAnsi="Calibri" w:cs="Calibri"/>
+              </w:rPr>
               <w:t xml:space="preserve"> Rents_</w:t>
             </w:r>
             <w:r>
+              <w:rPr>
+                <w:rFonts w:ascii="Calibri" w:hAnsi="Calibri" w:cs="Calibri"/>
+              </w:rPr>
               <w:t>i</w:t>
             </w:r>
             <w:r>
+              <w:rPr>
+                <w:rFonts w:ascii="Calibri" w:hAnsi="Calibri" w:cs="Calibri"/>
+              </w:rPr>
               <w:t xml:space="preserve"> + β</w:t>
             </w:r>
             <w:r>
+              <w:rPr>
+                <w:rFonts w:ascii="Calibri" w:hAnsi="Calibri" w:cs="Calibri"/>
+              </w:rPr>
               <w:t>6</w:t>
             </w:r>
             <w:r>
-              <w:t xml:space="preserve"> (Inst×Rents)_i + ε_i</w:t>
+              <w:rPr>
+                <w:rFonts w:ascii="Calibri" w:hAnsi="Calibri" w:cs="Calibri"/>
+              </w:rPr>
+              <w:t xml:space="preserve"> (</w:t>
+            </w:r>
+            <w:r>
+              <w:rPr>
+                <w:rFonts w:ascii="Calibri" w:hAnsi="Calibri" w:cs="Calibri"/>
+              </w:rPr>
+              <w:t>Gov</w:t>
+            </w:r>
+            <w:r>
+              <w:rPr>
+                <w:rFonts w:ascii="Calibri" w:hAnsi="Calibri" w:cs="Calibri"/>
+              </w:rPr>
+              <w:t>×Rents)_i + ε_i</w:t>
             </w:r>
           </w:p>
         </w:tc>
@@ -5335,18 +5223,45 @@
               </w:rPr>
             </w:pPr>
             <w:r>
-              <w:t>log(GDPpc_i) = α + β1 Inst_i</w:t>
-            </w:r>
-            <w:r>
+              <w:rPr>
+                <w:rFonts w:ascii="Calibri" w:hAnsi="Calibri" w:cs="Calibri"/>
+              </w:rPr>
+              <w:t xml:space="preserve">log(GDPpc_i) = α + β1 </w:t>
+            </w:r>
+            <w:r>
+              <w:rPr>
+                <w:rFonts w:ascii="Calibri" w:hAnsi="Calibri" w:cs="Calibri"/>
+              </w:rPr>
+              <w:t>Gov</w:t>
+            </w:r>
+            <w:r>
+              <w:rPr>
+                <w:rFonts w:ascii="Calibri" w:hAnsi="Calibri" w:cs="Calibri"/>
+              </w:rPr>
+              <w:t>_i</w:t>
+            </w:r>
+            <w:r>
+              <w:rPr>
+                <w:rFonts w:ascii="Calibri" w:hAnsi="Calibri" w:cs="Calibri"/>
+              </w:rPr>
               <w:t xml:space="preserve"> </w:t>
             </w:r>
             <w:r>
+              <w:rPr>
+                <w:rFonts w:ascii="Calibri" w:hAnsi="Calibri" w:cs="Calibri"/>
+              </w:rPr>
               <w:t>+ β2 HC_i</w:t>
             </w:r>
             <w:r>
+              <w:rPr>
+                <w:rFonts w:ascii="Calibri" w:hAnsi="Calibri" w:cs="Calibri"/>
+              </w:rPr>
               <w:t xml:space="preserve"> </w:t>
             </w:r>
             <w:r>
+              <w:rPr>
+                <w:rFonts w:ascii="Calibri" w:hAnsi="Calibri" w:cs="Calibri"/>
+              </w:rPr>
               <w:t>+ β3 GCF_i + β4 Trade_i + β5 Rents_i + β6 FDI_i + ε_i</w:t>
             </w:r>
           </w:p>
@@ -5355,6 +5270,149 @@
     </w:tbl>
     <w:p>
       <w:pPr>
+        <w:rPr>
+          <w:rFonts w:ascii="Calibri" w:hAnsi="Calibri" w:cs="Calibri"/>
+        </w:rPr>
+      </w:pPr>
+    </w:p>
+    <w:p>
+      <w:pPr>
+        <w:rPr>
+          <w:rFonts w:ascii="Calibri" w:hAnsi="Calibri" w:cs="Calibri"/>
+        </w:rPr>
+      </w:pPr>
+    </w:p>
+    <w:p>
+      <w:pPr>
+        <w:spacing w:after="0"/>
+        <w:rPr>
+          <w:rFonts w:ascii="Calibri" w:hAnsi="Calibri" w:cs="Calibri"/>
+          <w:b/>
+          <w:bCs/>
+          <w:sz w:val="23"/>
+          <w:szCs w:val="23"/>
+        </w:rPr>
+      </w:pPr>
+      <w:r>
+        <w:rPr>
+          <w:rFonts w:ascii="Calibri" w:hAnsi="Calibri" w:cs="Calibri"/>
+          <w:b/>
+          <w:bCs/>
+          <w:sz w:val="23"/>
+          <w:szCs w:val="23"/>
+        </w:rPr>
+        <w:lastRenderedPageBreak/>
+        <w:t xml:space="preserve">Why </w:t>
+      </w:r>
+      <w:r>
+        <w:rPr>
+          <w:rFonts w:ascii="Calibri" w:hAnsi="Calibri" w:cs="Calibri"/>
+          <w:b/>
+          <w:bCs/>
+          <w:sz w:val="23"/>
+          <w:szCs w:val="23"/>
+        </w:rPr>
+        <w:t>M</w:t>
+      </w:r>
+      <w:r>
+        <w:rPr>
+          <w:rFonts w:ascii="Calibri" w:hAnsi="Calibri" w:cs="Calibri"/>
+          <w:b/>
+          <w:bCs/>
+          <w:sz w:val="23"/>
+          <w:szCs w:val="23"/>
+        </w:rPr>
+        <w:t xml:space="preserve">anufacturing and </w:t>
+      </w:r>
+      <w:r>
+        <w:rPr>
+          <w:rFonts w:ascii="Calibri" w:hAnsi="Calibri" w:cs="Calibri"/>
+          <w:b/>
+          <w:bCs/>
+          <w:sz w:val="23"/>
+          <w:szCs w:val="23"/>
+        </w:rPr>
+        <w:t>S</w:t>
+      </w:r>
+      <w:r>
+        <w:rPr>
+          <w:rFonts w:ascii="Calibri" w:hAnsi="Calibri" w:cs="Calibri"/>
+          <w:b/>
+          <w:bCs/>
+          <w:sz w:val="23"/>
+          <w:szCs w:val="23"/>
+        </w:rPr>
+        <w:t>ervices should be tested separately first</w:t>
+      </w:r>
+    </w:p>
+    <w:p>
+      <w:pPr>
+        <w:spacing w:after="0"/>
+        <w:rPr>
+          <w:rFonts w:ascii="Calibri" w:hAnsi="Calibri" w:cs="Calibri"/>
+          <w:b/>
+          <w:bCs/>
+        </w:rPr>
+      </w:pPr>
+      <w:r>
+        <w:rPr>
+          <w:rFonts w:ascii="Calibri" w:hAnsi="Calibri" w:cs="Calibri"/>
+          <w:szCs w:val="21"/>
+        </w:rPr>
+        <w:t xml:space="preserve">Manufacturing share and services share </w:t>
+      </w:r>
+      <w:r>
+        <w:rPr>
+          <w:rFonts w:ascii="Calibri" w:hAnsi="Calibri" w:cs="Calibri"/>
+          <w:szCs w:val="21"/>
+        </w:rPr>
+        <w:t>are</w:t>
+      </w:r>
+      <w:r>
+        <w:rPr>
+          <w:rFonts w:ascii="Calibri" w:hAnsi="Calibri" w:cs="Calibri"/>
+          <w:szCs w:val="21"/>
+        </w:rPr>
+        <w:t xml:space="preserve"> not</w:t>
+      </w:r>
+      <w:r>
+        <w:rPr>
+          <w:rFonts w:ascii="Calibri" w:hAnsi="Calibri" w:cs="Calibri"/>
+          <w:szCs w:val="21"/>
+        </w:rPr>
+        <w:t xml:space="preserve"> treated as two harmless regressors like any others: they are shares of the productive structure, so they may move in a mirror-like way or, in any case, not independently. For this reason, two separate models (manufacturing only and services only) </w:t>
+      </w:r>
+      <w:r>
+        <w:rPr>
+          <w:rFonts w:ascii="Calibri" w:hAnsi="Calibri" w:cs="Calibri"/>
+          <w:szCs w:val="21"/>
+        </w:rPr>
+        <w:t xml:space="preserve">are implemented </w:t>
+      </w:r>
+      <w:r>
+        <w:rPr>
+          <w:rFonts w:ascii="Calibri" w:hAnsi="Calibri" w:cs="Calibri"/>
+          <w:szCs w:val="21"/>
+        </w:rPr>
+        <w:t xml:space="preserve">and only then a third model with both variables. </w:t>
+      </w:r>
+      <w:r>
+        <w:rPr>
+          <w:rFonts w:ascii="Calibri" w:hAnsi="Calibri" w:cs="Calibri"/>
+          <w:szCs w:val="21"/>
+        </w:rPr>
+        <w:t xml:space="preserve">This allows a clearer distinction between </w:t>
+      </w:r>
+      <w:r>
+        <w:rPr>
+          <w:rFonts w:ascii="Calibri" w:hAnsi="Calibri" w:cs="Calibri"/>
+          <w:szCs w:val="21"/>
+        </w:rPr>
+        <w:t>a specific effect from manufacturing, a specific effect from services, and the behavior of the coefficients when both shares compete within the same model.</w:t>
+      </w:r>
+    </w:p>
+    <w:p>
+      <w:pPr>
         <w:pStyle w:val="Heading2"/>
         <w:rPr>
           <w:rFonts w:ascii="Calibri" w:hAnsi="Calibri" w:cs="Calibri"/>
@@ -5369,7 +5427,25 @@
           <w:sz w:val="25"/>
           <w:szCs w:val="25"/>
         </w:rPr>
-        <w:t>Why manufacturing and services should be tested separately first</w:t>
+        <w:t xml:space="preserve">Growth </w:t>
+      </w:r>
+      <w:r>
+        <w:rPr>
+          <w:rFonts w:ascii="Calibri" w:hAnsi="Calibri" w:cs="Calibri"/>
+          <w:color w:val="2F5597"/>
+          <w:sz w:val="25"/>
+          <w:szCs w:val="25"/>
+        </w:rPr>
+        <w:t>M</w:t>
+      </w:r>
+      <w:r>
+        <w:rPr>
+          <w:rFonts w:ascii="Calibri" w:hAnsi="Calibri" w:cs="Calibri"/>
+          <w:color w:val="2F5597"/>
+          <w:sz w:val="25"/>
+          <w:szCs w:val="25"/>
+        </w:rPr>
+        <w:t>odel (Model 2)</w:t>
       </w:r>
     </w:p>
     <w:p>
@@ -5385,115 +5461,35 @@
           <w:rFonts w:ascii="Calibri" w:hAnsi="Calibri" w:cs="Calibri"/>
           <w:szCs w:val="21"/>
         </w:rPr>
-        <w:t xml:space="preserve">Manufacturing share and services share </w:t>
+        <w:t>The</w:t>
       </w:r>
       <w:r>
         <w:rPr>
           <w:rFonts w:ascii="Calibri" w:hAnsi="Calibri" w:cs="Calibri"/>
           <w:szCs w:val="21"/>
         </w:rPr>
-        <w:t>is not</w:t>
+        <w:t xml:space="preserve"> analy</w:t>
       </w:r>
       <w:r>
         <w:rPr>
           <w:rFonts w:ascii="Calibri" w:hAnsi="Calibri" w:cs="Calibri"/>
           <w:szCs w:val="21"/>
         </w:rPr>
-        <w:t xml:space="preserve"> treated as two harmless regressors like any others: they are shares of the productive structure, so they may move in a mirror-like way or, in any case, not independently. For this reason, two separate models (manufacturing only and services only) </w:t>
+        <w:t>tical framework</w:t>
       </w:r>
       <w:r>
         <w:rPr>
           <w:rFonts w:ascii="Calibri" w:hAnsi="Calibri" w:cs="Calibri"/>
           <w:szCs w:val="21"/>
         </w:rPr>
-        <w:t xml:space="preserve">are implemented </w:t>
+        <w:t xml:space="preserve"> is </w:t>
       </w:r>
       <w:r>
         <w:rPr>
           <w:rFonts w:ascii="Calibri" w:hAnsi="Calibri" w:cs="Calibri"/>
           <w:szCs w:val="21"/>
         </w:rPr>
-        <w:t xml:space="preserve">and only then a third model with both variables. </w:t>
-      </w:r>
-      <w:r>
-        <w:rPr>
-          <w:rFonts w:ascii="Calibri" w:hAnsi="Calibri" w:cs="Calibri"/>
-          <w:szCs w:val="21"/>
-        </w:rPr>
-        <w:t>This allows a clearer distinction between</w:t>
-      </w:r>
-      <w:r>
-        <w:rPr>
-          <w:rFonts w:ascii="Calibri" w:hAnsi="Calibri" w:cs="Calibri"/>
-          <w:szCs w:val="21"/>
-        </w:rPr>
-        <w:t xml:space="preserve"> </w:t>
-      </w:r>
-      <w:r>
-        <w:rPr>
-          <w:rFonts w:ascii="Calibri" w:hAnsi="Calibri" w:cs="Calibri"/>
-          <w:szCs w:val="21"/>
-        </w:rPr>
-        <w:t xml:space="preserve">a specific effect from manufacturing, a </w:t>
-      </w:r>
-      <w:r>
-        <w:rPr>
-          <w:rFonts w:ascii="Calibri" w:hAnsi="Calibri" w:cs="Calibri"/>
-          <w:szCs w:val="21"/>
-        </w:rPr>
-        <w:lastRenderedPageBreak/>
-        <w:t>specific effect from services, and the behavior of the coefficients when both shares compete within the same model.</w:t>
-      </w:r>
-    </w:p>
-    <w:p>
-      <w:pPr>
-        <w:pStyle w:val="Heading2"/>
-        <w:rPr>
-          <w:rFonts w:ascii="Calibri" w:hAnsi="Calibri" w:cs="Calibri"/>
-          <w:sz w:val="25"/>
-          <w:szCs w:val="25"/>
-        </w:rPr>
-      </w:pPr>
-      <w:r>
-        <w:rPr>
-          <w:rFonts w:ascii="Calibri" w:hAnsi="Calibri" w:cs="Calibri"/>
-          <w:color w:val="2F5597"/>
-          <w:sz w:val="25"/>
-          <w:szCs w:val="25"/>
-        </w:rPr>
-        <w:t>Growth model (Model 2)</w:t>
-      </w:r>
-    </w:p>
-    <w:p>
-      <w:pPr>
-        <w:spacing w:after="0"/>
-        <w:rPr>
-          <w:rFonts w:ascii="Calibri" w:hAnsi="Calibri" w:cs="Calibri"/>
-          <w:szCs w:val="21"/>
-        </w:rPr>
-      </w:pPr>
-      <w:r>
-        <w:rPr>
-          <w:rFonts w:ascii="Calibri" w:hAnsi="Calibri" w:cs="Calibri"/>
-          <w:szCs w:val="21"/>
-        </w:rPr>
-        <w:t xml:space="preserve">For the growth </w:t>
-      </w:r>
-      <w:r>
-        <w:rPr>
-          <w:rFonts w:ascii="Calibri" w:hAnsi="Calibri" w:cs="Calibri"/>
-          <w:szCs w:val="21"/>
-          <w:highlight w:val="yellow"/>
-        </w:rPr>
-        <w:t>dataset</w:t>
-      </w:r>
-      <w:r>
-        <w:rPr>
-          <w:rFonts w:ascii="Calibri" w:hAnsi="Calibri" w:cs="Calibri"/>
-          <w:szCs w:val="21"/>
-          <w:highlight w:val="yellow"/>
-        </w:rPr>
-        <w:t xml:space="preserve"> the following analysis is constructed</w:t>
+        <w:t>implemented as follows</w:t>
       </w:r>
       <w:r>
         <w:rPr>
@@ -5515,22 +5511,21 @@
     <w:p>
       <w:pPr>
         <w:spacing w:after="0"/>
+        <w:rPr>
+          <w:rFonts w:ascii="Calibri" w:hAnsi="Calibri" w:cs="Calibri"/>
+        </w:rPr>
       </w:pPr>
       <w:r>
         <w:rPr>
           <w:rFonts w:ascii="Calibri" w:hAnsi="Calibri" w:cs="Calibri"/>
           <w:szCs w:val="21"/>
         </w:rPr>
-        <w:t>GDPpc</w:t>
+        <w:t>GDPpcGrowth(avg)_i</w:t>
       </w:r>
       <w:r>
         <w:rPr>
           <w:rFonts w:ascii="Calibri" w:hAnsi="Calibri" w:cs="Calibri"/>
-          <w:szCs w:val="21"/>
-        </w:rPr>
-        <w:t>Growth(avg)_i</w:t>
-      </w:r>
-      <w:r>
+        </w:rPr>
         <w:t xml:space="preserve">= α + β1 </w:t>
       </w:r>
       <w:r>
@@ -5538,42 +5533,33 @@
           <w:rFonts w:ascii="Calibri" w:hAnsi="Calibri" w:cs="Calibri"/>
           <w:szCs w:val="21"/>
         </w:rPr>
-        <w:t>Log</w:t>
+        <w:t xml:space="preserve">Log(GDPpc_2000_i) </w:t>
       </w:r>
       <w:r>
         <w:rPr>
           <w:rFonts w:ascii="Calibri" w:hAnsi="Calibri" w:cs="Calibri"/>
-          <w:szCs w:val="21"/>
-        </w:rPr>
-        <w:t>(</w:t>
+        </w:rPr>
+        <w:t xml:space="preserve">+ β2 </w:t>
       </w:r>
       <w:r>
         <w:rPr>
           <w:rFonts w:ascii="Calibri" w:hAnsi="Calibri" w:cs="Calibri"/>
-          <w:szCs w:val="21"/>
-        </w:rPr>
-        <w:t>GDPpc</w:t>
+        </w:rPr>
+        <w:t>Governance</w:t>
       </w:r>
       <w:r>
         <w:rPr>
           <w:rFonts w:ascii="Calibri" w:hAnsi="Calibri" w:cs="Calibri"/>
-          <w:szCs w:val="21"/>
-        </w:rPr>
-        <w:t xml:space="preserve">_2000_i) </w:t>
-      </w:r>
-      <w:r>
-        <w:t>+</w:t>
-      </w:r>
-      <w:r>
-        <w:t xml:space="preserve"> </w:t>
-      </w:r>
-      <w:r>
-        <w:t>β2 Ist(avg)_i + β3 HC(avg)_i + β4 GCF(avg)_i + β5 Trade(avg)_i + ε_i</w:t>
+        </w:rPr>
+        <w:t>(avg)_i + β3 HC(avg)_i + β4 GCF(avg)_i + β5 Trade(avg)_i + ε_i</w:t>
       </w:r>
     </w:p>
     <w:p>
       <w:pPr>
         <w:spacing w:after="0"/>
+        <w:rPr>
+          <w:rFonts w:ascii="Calibri" w:hAnsi="Calibri" w:cs="Calibri"/>
+        </w:rPr>
       </w:pPr>
     </w:p>
     <w:p>
@@ -5635,14 +5621,35 @@
           <w:rFonts w:ascii="Calibri" w:hAnsi="Calibri" w:cs="Calibri"/>
           <w:color w:val="203864"/>
         </w:rPr>
-        <w:t>5</w:t>
+        <w:t xml:space="preserve">5. Correlation and </w:t>
       </w:r>
       <w:r>
         <w:rPr>
           <w:rFonts w:ascii="Calibri" w:hAnsi="Calibri" w:cs="Calibri"/>
           <w:color w:val="203864"/>
         </w:rPr>
-        <w:t>. Correlation and scatter plan</w:t>
+        <w:t>S</w:t>
+      </w:r>
+      <w:r>
+        <w:rPr>
+          <w:rFonts w:ascii="Calibri" w:hAnsi="Calibri" w:cs="Calibri"/>
+          <w:color w:val="203864"/>
+        </w:rPr>
+        <w:t xml:space="preserve">catter </w:t>
+      </w:r>
+      <w:r>
+        <w:rPr>
+          <w:rFonts w:ascii="Calibri" w:hAnsi="Calibri" w:cs="Calibri"/>
+          <w:color w:val="203864"/>
+        </w:rPr>
+        <w:t>P</w:t>
+      </w:r>
+      <w:r>
+        <w:rPr>
+          <w:rFonts w:ascii="Calibri" w:hAnsi="Calibri" w:cs="Calibri"/>
+          <w:color w:val="203864"/>
+        </w:rPr>
+        <w:t>lan</w:t>
       </w:r>
     </w:p>
     <w:p>
@@ -5679,7 +5686,14 @@
           <w:rFonts w:ascii="Calibri" w:hAnsi="Calibri" w:cs="Calibri"/>
           <w:szCs w:val="21"/>
         </w:rPr>
-        <w:t>is not</w:t>
+        <w:t xml:space="preserve">are </w:t>
+      </w:r>
+      <w:r>
+        <w:rPr>
+          <w:rFonts w:ascii="Calibri" w:hAnsi="Calibri" w:cs="Calibri"/>
+          <w:szCs w:val="21"/>
+        </w:rPr>
+        <w:t>not</w:t>
       </w:r>
       <w:r>
         <w:rPr>
@@ -5772,7 +5786,27 @@
                 <w:sz w:val="23"/>
                 <w:szCs w:val="23"/>
               </w:rPr>
-              <w:t>Scatter block</w:t>
+              <w:t xml:space="preserve">Scatter </w:t>
+            </w:r>
+            <w:r>
+              <w:rPr>
+                <w:rFonts w:ascii="Calibri" w:hAnsi="Calibri" w:cs="Calibri"/>
+                <w:b/>
+                <w:color w:val="203864"/>
+                <w:sz w:val="23"/>
+                <w:szCs w:val="23"/>
+              </w:rPr>
+              <w:t>B</w:t>
+            </w:r>
+            <w:r>
+              <w:rPr>
+                <w:rFonts w:ascii="Calibri" w:hAnsi="Calibri" w:cs="Calibri"/>
+                <w:b/>
+                <w:color w:val="203864"/>
+                <w:sz w:val="23"/>
+                <w:szCs w:val="23"/>
+              </w:rPr>
+              <w:t>lock</w:t>
             </w:r>
           </w:p>
         </w:tc>
@@ -5806,7 +5840,27 @@
                 <w:sz w:val="23"/>
                 <w:szCs w:val="23"/>
               </w:rPr>
-              <w:t>Key relationships</w:t>
+              <w:t xml:space="preserve">Key </w:t>
+            </w:r>
+            <w:r>
+              <w:rPr>
+                <w:rFonts w:ascii="Calibri" w:hAnsi="Calibri" w:cs="Calibri"/>
+                <w:b/>
+                <w:color w:val="203864"/>
+                <w:sz w:val="23"/>
+                <w:szCs w:val="23"/>
+              </w:rPr>
+              <w:t>R</w:t>
+            </w:r>
+            <w:r>
+              <w:rPr>
+                <w:rFonts w:ascii="Calibri" w:hAnsi="Calibri" w:cs="Calibri"/>
+                <w:b/>
+                <w:color w:val="203864"/>
+                <w:sz w:val="23"/>
+                <w:szCs w:val="23"/>
+              </w:rPr>
+              <w:t>elationships</w:t>
             </w:r>
           </w:p>
         </w:tc>
@@ -5840,7 +5894,7 @@
                 <w:sz w:val="23"/>
                 <w:szCs w:val="23"/>
               </w:rPr>
-              <w:t>Suggested clustering priority</w:t>
+              <w:t>Clustering</w:t>
             </w:r>
           </w:p>
         </w:tc>
@@ -5873,7 +5927,21 @@
                 <w:rFonts w:ascii="Calibri" w:hAnsi="Calibri" w:cs="Calibri"/>
                 <w:szCs w:val="21"/>
               </w:rPr>
-              <w:t>Block A — Institution-Based Relationships</w:t>
+              <w:t xml:space="preserve">Block A — </w:t>
+            </w:r>
+            <w:r>
+              <w:rPr>
+                <w:rFonts w:ascii="Calibri" w:hAnsi="Calibri" w:cs="Calibri"/>
+                <w:szCs w:val="21"/>
+              </w:rPr>
+              <w:t>Governance</w:t>
+            </w:r>
+            <w:r>
+              <w:rPr>
+                <w:rFonts w:ascii="Calibri" w:hAnsi="Calibri" w:cs="Calibri"/>
+                <w:szCs w:val="21"/>
+              </w:rPr>
+              <w:t>-Based Relationships</w:t>
             </w:r>
           </w:p>
         </w:tc>
@@ -5929,7 +5997,7 @@
                 <w:rFonts w:ascii="Calibri" w:hAnsi="Calibri" w:cs="Calibri"/>
                 <w:szCs w:val="21"/>
               </w:rPr>
-              <w:t>Here, the most sensible clustering is often Institutional Stability</w:t>
+              <w:t>Institutional Stability</w:t>
             </w:r>
             <w:r>
               <w:rPr>
@@ -6025,7 +6093,7 @@
                 <w:rFonts w:ascii="Calibri" w:hAnsi="Calibri" w:cs="Calibri"/>
                 <w:szCs w:val="21"/>
               </w:rPr>
-              <w:t>Here, Core Growth Model is often the most natural clustering, because productive structure is the core of the block.</w:t>
+              <w:t>Core Growth Model</w:t>
             </w:r>
           </w:p>
         </w:tc>
@@ -6114,7 +6182,7 @@
                 <w:rFonts w:ascii="Calibri" w:hAnsi="Calibri" w:cs="Calibri"/>
                 <w:szCs w:val="21"/>
               </w:rPr>
-              <w:t>Here, Region or Institutional Stability tend to be the most informative clustering dimensions.</w:t>
+              <w:t>Region or Institutional Stability</w:t>
             </w:r>
           </w:p>
         </w:tc>
@@ -6133,7 +6201,6 @@
         <w:spacing w:after="0"/>
         <w:rPr>
           <w:rFonts w:ascii="Calibri" w:hAnsi="Calibri" w:cs="Calibri"/>
-          <w:szCs w:val="21"/>
         </w:rPr>
       </w:pPr>
     </w:p>
@@ -6142,12 +6209,36 @@
         <w:spacing w:after="0"/>
         <w:rPr>
           <w:rFonts w:ascii="Calibri" w:hAnsi="Calibri" w:cs="Calibri"/>
-          <w:szCs w:val="21"/>
         </w:rPr>
       </w:pPr>
     </w:p>
     <w:p>
       <w:pPr>
+        <w:spacing w:after="0"/>
+        <w:rPr>
+          <w:rFonts w:ascii="Calibri" w:hAnsi="Calibri" w:cs="Calibri"/>
+        </w:rPr>
+      </w:pPr>
+    </w:p>
+    <w:p>
+      <w:pPr>
+        <w:spacing w:after="0"/>
+        <w:rPr>
+          <w:rFonts w:ascii="Calibri" w:hAnsi="Calibri" w:cs="Calibri"/>
+        </w:rPr>
+      </w:pPr>
+    </w:p>
+    <w:p>
+      <w:pPr>
+        <w:spacing w:after="0"/>
+        <w:rPr>
+          <w:rFonts w:ascii="Calibri" w:hAnsi="Calibri" w:cs="Calibri"/>
+          <w:szCs w:val="21"/>
+        </w:rPr>
+      </w:pPr>
+    </w:p>
+    <w:p>
+      <w:pPr>
         <w:pStyle w:val="Heading1"/>
         <w:spacing w:before="0"/>
         <w:rPr>
@@ -6159,14 +6250,15 @@
           <w:rFonts w:ascii="Calibri" w:hAnsi="Calibri" w:cs="Calibri"/>
           <w:color w:val="203864"/>
         </w:rPr>
-        <w:t>6</w:t>
+        <w:lastRenderedPageBreak/>
+        <w:t xml:space="preserve">6. </w:t>
       </w:r>
       <w:r>
         <w:rPr>
           <w:rFonts w:ascii="Calibri" w:hAnsi="Calibri" w:cs="Calibri"/>
           <w:color w:val="203864"/>
         </w:rPr>
-        <w:t>. What robustness means in this project</w:t>
+        <w:t>Robustness</w:t>
       </w:r>
     </w:p>
     <w:p>
@@ -6181,9 +6273,8 @@
         <w:rPr>
           <w:rFonts w:ascii="Calibri" w:hAnsi="Calibri" w:cs="Calibri"/>
           <w:szCs w:val="21"/>
-          <w:highlight w:val="yellow"/>
-        </w:rPr>
-        <w:t>Robustness does not mean adding regressors at random or changing the specification until the desired sign appears. It means testing whether the main result holds when you modify some element of the model in a reasoned way.</w:t>
+        </w:rPr>
+        <w:t>Robustness is defined as the evaluation of whether the main empirical results remain stable under alternative, theoretically grounded modifications of the model specification.</w:t>
       </w:r>
     </w:p>
     <w:p>
@@ -6240,7 +6331,27 @@
                 <w:sz w:val="23"/>
                 <w:szCs w:val="23"/>
               </w:rPr>
-              <w:t>Type of robustness</w:t>
+              <w:t xml:space="preserve">Type of </w:t>
+            </w:r>
+            <w:r>
+              <w:rPr>
+                <w:rFonts w:ascii="Calibri" w:hAnsi="Calibri" w:cs="Calibri"/>
+                <w:b/>
+                <w:color w:val="203864"/>
+                <w:sz w:val="23"/>
+                <w:szCs w:val="23"/>
+              </w:rPr>
+              <w:t>R</w:t>
+            </w:r>
+            <w:r>
+              <w:rPr>
+                <w:rFonts w:ascii="Calibri" w:hAnsi="Calibri" w:cs="Calibri"/>
+                <w:b/>
+                <w:color w:val="203864"/>
+                <w:sz w:val="23"/>
+                <w:szCs w:val="23"/>
+              </w:rPr>
+              <w:t>obustness</w:t>
             </w:r>
           </w:p>
         </w:tc>
@@ -6274,27 +6385,7 @@
                 <w:sz w:val="23"/>
                 <w:szCs w:val="23"/>
               </w:rPr>
-              <w:t xml:space="preserve">Meaning </w:t>
-            </w:r>
-            <w:r>
-              <w:rPr>
-                <w:rFonts w:ascii="Calibri" w:hAnsi="Calibri" w:cs="Calibri"/>
-                <w:b/>
-                <w:color w:val="203864"/>
-                <w:sz w:val="23"/>
-                <w:szCs w:val="23"/>
-              </w:rPr>
-              <w:t xml:space="preserve">the </w:t>
-            </w:r>
-            <w:r>
-              <w:rPr>
-                <w:rFonts w:ascii="Calibri" w:hAnsi="Calibri" w:cs="Calibri"/>
-                <w:b/>
-                <w:color w:val="203864"/>
-                <w:sz w:val="23"/>
-                <w:szCs w:val="23"/>
-              </w:rPr>
-              <w:t>setting</w:t>
+              <w:t>Interpretation</w:t>
             </w:r>
           </w:p>
         </w:tc>
@@ -6327,7 +6418,6 @@
                 <w:rFonts w:ascii="Calibri" w:hAnsi="Calibri" w:cs="Calibri"/>
                 <w:szCs w:val="21"/>
               </w:rPr>
-              <w:lastRenderedPageBreak/>
               <w:t>Specification robustness</w:t>
             </w:r>
           </w:p>
@@ -6355,16 +6445,8 @@
               <w:rPr>
                 <w:rFonts w:ascii="Calibri" w:hAnsi="Calibri" w:cs="Calibri"/>
                 <w:szCs w:val="21"/>
-                <w:highlight w:val="yellow"/>
-              </w:rPr>
-              <w:t xml:space="preserve">Check </w:t>
-            </w:r>
-            <w:r>
-              <w:rPr>
-                <w:rFonts w:ascii="Calibri" w:hAnsi="Calibri" w:cs="Calibri"/>
-                <w:szCs w:val="21"/>
-              </w:rPr>
-              <w:t>whether governance, HCI+, trade, or GCF change drastically in sign or significance when moving from the baseline to models with structure, resources, or FDI.</w:t>
+              </w:rPr>
+              <w:t>Changes in the sign and statistical significance of key coefficients are evaluated when moving from the baseline specification to extended models including structure, resources, or FDI.</w:t>
             </w:r>
           </w:p>
         </w:tc>
@@ -6424,16 +6506,8 @@
               <w:rPr>
                 <w:rFonts w:ascii="Calibri" w:hAnsi="Calibri" w:cs="Calibri"/>
                 <w:szCs w:val="21"/>
-                <w:highlight w:val="yellow"/>
-              </w:rPr>
-              <w:t>Compare</w:t>
-            </w:r>
-            <w:r>
-              <w:rPr>
-                <w:rFonts w:ascii="Calibri" w:hAnsi="Calibri" w:cs="Calibri"/>
-                <w:szCs w:val="21"/>
-              </w:rPr>
-              <w:t xml:space="preserve"> manufacturing only, services only, and both together to see how much the result depends on the choice of structural proxy.</w:t>
+              </w:rPr>
+              <w:t>Alternative specifications including manufacturing only, services only, and both jointly are compared to assess the sensitivity of results to the chosen structural proxy.</w:t>
             </w:r>
           </w:p>
         </w:tc>
@@ -6493,16 +6567,8 @@
               <w:rPr>
                 <w:rFonts w:ascii="Calibri" w:hAnsi="Calibri" w:cs="Calibri"/>
                 <w:szCs w:val="21"/>
-                <w:highlight w:val="yellow"/>
-              </w:rPr>
-              <w:t xml:space="preserve">Re-estimate </w:t>
-            </w:r>
-            <w:r>
-              <w:rPr>
-                <w:rFonts w:ascii="Calibri" w:hAnsi="Calibri" w:cs="Calibri"/>
-                <w:szCs w:val="21"/>
-              </w:rPr>
-              <w:t>the model excluding one or two clearly leverage-driven countries, for example extreme cases such as Guyana or Panama if the plots show strong influence.</w:t>
+              </w:rPr>
+              <w:t>The model is re-estimated after excluding observations identified as high-leverage or outliers in the graphical analysis.</w:t>
             </w:r>
           </w:p>
         </w:tc>
@@ -6562,16 +6628,8 @@
               <w:rPr>
                 <w:rFonts w:ascii="Calibri" w:hAnsi="Calibri" w:cs="Calibri"/>
                 <w:szCs w:val="21"/>
-                <w:highlight w:val="yellow"/>
-              </w:rPr>
-              <w:t>Use</w:t>
-            </w:r>
-            <w:r>
-              <w:rPr>
-                <w:rFonts w:ascii="Calibri" w:hAnsi="Calibri" w:cs="Calibri"/>
-                <w:szCs w:val="21"/>
-              </w:rPr>
-              <w:t xml:space="preserve"> the dataset with z-scores to compare the relative weight of regressors on a common scale. This does not replace the main model, but helps comparative interpretation.</w:t>
+              </w:rPr>
+              <w:t>A standardized version of the dataset (z-scores) is used to compare the relative magnitude of coefficients on a common scale.</w:t>
             </w:r>
           </w:p>
         </w:tc>
@@ -6631,16 +6689,8 @@
               <w:rPr>
                 <w:rFonts w:ascii="Calibri" w:hAnsi="Calibri" w:cs="Calibri"/>
                 <w:szCs w:val="21"/>
-                <w:highlight w:val="yellow"/>
-              </w:rPr>
-              <w:t>Verify</w:t>
-            </w:r>
-            <w:r>
-              <w:rPr>
-                <w:rFonts w:ascii="Calibri" w:hAnsi="Calibri" w:cs="Calibri"/>
-                <w:szCs w:val="21"/>
-              </w:rPr>
-              <w:t xml:space="preserve"> how many observations each specification uses. A coefficient may change not only because of the specification, but because the effective sample changes.</w:t>
+              </w:rPr>
+              <w:t>The effective number of observations is reported for each specification, allowing for the assessment of potential sample-driven variation in the results.</w:t>
             </w:r>
           </w:p>
         </w:tc>
@@ -6666,25 +6716,8 @@
         <w:rPr>
           <w:rFonts w:ascii="Calibri" w:hAnsi="Calibri" w:cs="Calibri"/>
           <w:szCs w:val="21"/>
-          <w:highlight w:val="yellow"/>
-        </w:rPr>
-        <w:t xml:space="preserve">In </w:t>
-      </w:r>
-      <w:r>
-        <w:rPr>
-          <w:rFonts w:ascii="Calibri" w:hAnsi="Calibri" w:cs="Calibri"/>
-          <w:szCs w:val="21"/>
-          <w:highlight w:val="yellow"/>
-        </w:rPr>
-        <w:t>this</w:t>
-      </w:r>
-      <w:r>
-        <w:rPr>
-          <w:rFonts w:ascii="Calibri" w:hAnsi="Calibri" w:cs="Calibri"/>
-          <w:szCs w:val="21"/>
-          <w:highlight w:val="yellow"/>
-        </w:rPr>
-        <w:t xml:space="preserve"> project, the most realistic robustness, at least in the first phase, is specification and sample robustness. There is no need to start with advanced techniques: it is enough to compare coefficient, p-value, R-squared, number of observations, and sensitivity to outliers transparently.</w:t>
+        </w:rPr>
+        <w:t>In this project, the most relevant robustness dimensions are specification and sample robustness. Emphasis is placed on transparent comparison of coefficients, statistical significance, goodness of fit, and sensitivity to influential observations.</w:t>
       </w:r>
     </w:p>
     <w:p>
@@ -6707,30 +6740,258 @@
       <w:r>
         <w:rPr>
           <w:rFonts w:ascii="Calibri" w:hAnsi="Calibri" w:cs="Calibri"/>
-          <w:color w:val="203864"/>
-        </w:rPr>
-        <w:t>7</w:t>
+        </w:rPr>
+        <w:t xml:space="preserve">7. </w:t>
       </w:r>
       <w:r>
         <w:rPr>
           <w:rFonts w:ascii="Calibri" w:hAnsi="Calibri" w:cs="Calibri"/>
-          <w:color w:val="203864"/>
-        </w:rPr>
-        <w:t xml:space="preserve">. </w:t>
+        </w:rPr>
+        <w:t xml:space="preserve">Caveats and </w:t>
       </w:r>
       <w:r>
         <w:rPr>
           <w:rFonts w:ascii="Calibri" w:hAnsi="Calibri" w:cs="Calibri"/>
-          <w:color w:val="203864"/>
-        </w:rPr>
-        <w:t>Empirical pipeline and</w:t>
+        </w:rPr>
+        <w:t>D</w:t>
       </w:r>
       <w:r>
         <w:rPr>
           <w:rFonts w:ascii="Calibri" w:hAnsi="Calibri" w:cs="Calibri"/>
+        </w:rPr>
+        <w:t xml:space="preserve">ata </w:t>
+      </w:r>
+      <w:r>
+        <w:rPr>
+          <w:rFonts w:ascii="Calibri" w:hAnsi="Calibri" w:cs="Calibri"/>
+        </w:rPr>
+        <w:t>L</w:t>
+      </w:r>
+      <w:r>
+        <w:rPr>
+          <w:rFonts w:ascii="Calibri" w:hAnsi="Calibri" w:cs="Calibri"/>
+        </w:rPr>
+        <w:t>imitations</w:t>
+      </w:r>
+    </w:p>
+    <w:p>
+      <w:pPr>
+        <w:spacing w:after="0"/>
+        <w:rPr>
+          <w:rFonts w:ascii="Calibri" w:hAnsi="Calibri" w:cs="Calibri"/>
+          <w:szCs w:val="21"/>
+        </w:rPr>
+      </w:pPr>
+      <w:r>
+        <w:rPr>
+          <w:rFonts w:ascii="Calibri" w:hAnsi="Calibri" w:cs="Calibri"/>
+          <w:szCs w:val="21"/>
+        </w:rPr>
+        <w:t xml:space="preserve">The analysis relies on harmonized cross-country datasets that combine information from different sources (e.g. WDI, WGI). While variables are selected to maximize comparability, some measurement inconsistencies may remain, especially for variables such as human capital, governance, and natural resource rents. </w:t>
+      </w:r>
+    </w:p>
+    <w:p>
+      <w:pPr>
+        <w:spacing w:after="0"/>
+        <w:rPr>
+          <w:rFonts w:ascii="Calibri" w:hAnsi="Calibri" w:cs="Calibri"/>
+          <w:szCs w:val="21"/>
+        </w:rPr>
+      </w:pPr>
+    </w:p>
+    <w:p>
+      <w:pPr>
+        <w:spacing w:after="0"/>
+        <w:rPr>
+          <w:rFonts w:ascii="Calibri" w:hAnsi="Calibri" w:cs="Calibri"/>
+          <w:szCs w:val="21"/>
+        </w:rPr>
+      </w:pPr>
+      <w:r>
+        <w:rPr>
+          <w:rFonts w:ascii="Calibri" w:hAnsi="Calibri" w:cs="Calibri"/>
+          <w:szCs w:val="21"/>
+        </w:rPr>
+        <w:t>In addition, the cross-sectional nature of Model 1 and the relatively small sample size imply that results should be interpreted as indicative relationships rather than causal estimates. Outliers and leverage points may influence both correlations and regression coefficients, which is why they are explicitly inspected in the diagnostic phase and addressed through robustness checks.</w:t>
+      </w:r>
+      <w:r>
+        <w:rPr>
+          <w:rFonts w:ascii="Calibri" w:hAnsi="Calibri" w:cs="Calibri"/>
+          <w:szCs w:val="21"/>
+        </w:rPr>
+        <w:t xml:space="preserve"> </w:t>
+      </w:r>
+    </w:p>
+    <w:p>
+      <w:pPr>
+        <w:spacing w:after="0"/>
+        <w:rPr>
+          <w:rFonts w:ascii="Calibri" w:hAnsi="Calibri" w:cs="Calibri"/>
+          <w:szCs w:val="21"/>
+        </w:rPr>
+      </w:pPr>
+    </w:p>
+    <w:p>
+      <w:pPr>
+        <w:spacing w:after="0"/>
+        <w:rPr>
+          <w:rFonts w:ascii="Calibri" w:hAnsi="Calibri" w:cs="Calibri"/>
+          <w:szCs w:val="21"/>
+        </w:rPr>
+      </w:pPr>
+      <w:r>
+        <w:rPr>
+          <w:rFonts w:ascii="Calibri" w:hAnsi="Calibri" w:cs="Calibri"/>
+          <w:szCs w:val="21"/>
+        </w:rPr>
+        <w:t>Finally, some structural variables (e.g. manufacturing and services shares) may capture overlapping aspects of the economic structure, potentially leading to multicollinearity when included jointly. Results are therefore interpreted with attention to coefficient stability across specifications.</w:t>
+      </w:r>
+    </w:p>
+    <w:p>
+      <w:pPr>
+        <w:spacing w:after="0"/>
+        <w:rPr>
+          <w:rFonts w:ascii="Calibri" w:hAnsi="Calibri" w:cs="Calibri"/>
+          <w:szCs w:val="21"/>
+        </w:rPr>
+      </w:pPr>
+    </w:p>
+    <w:p>
+      <w:pPr>
+        <w:spacing w:after="0"/>
+        <w:rPr>
+          <w:rFonts w:ascii="Calibri" w:hAnsi="Calibri" w:cs="Calibri"/>
+          <w:szCs w:val="21"/>
+        </w:rPr>
+      </w:pPr>
+    </w:p>
+    <w:p>
+      <w:pPr>
+        <w:pStyle w:val="Heading1"/>
+      </w:pPr>
+      <w:r>
+        <w:lastRenderedPageBreak/>
+        <w:t xml:space="preserve">Supporting </w:t>
+      </w:r>
+      <w:r>
+        <w:t>D</w:t>
+      </w:r>
+      <w:r>
+        <w:t xml:space="preserve">ata </w:t>
+      </w:r>
+      <w:r>
+        <w:t>Fi</w:t>
+      </w:r>
+      <w:r>
+        <w:t>les</w:t>
+      </w:r>
+    </w:p>
+    <w:p>
+      <w:pPr>
+        <w:spacing w:after="0"/>
+        <w:rPr>
+          <w:rFonts w:ascii="Calibri" w:hAnsi="Calibri" w:cs="Calibri"/>
+          <w:szCs w:val="21"/>
+        </w:rPr>
+      </w:pPr>
+      <w:r>
+        <w:rPr>
+          <w:rFonts w:ascii="Calibri" w:hAnsi="Calibri" w:cs="Calibri"/>
+          <w:szCs w:val="21"/>
+        </w:rPr>
+        <w:t>In addition to the main datasets used for estimation, several auxiliary CSV files are included to improve transparency and reproducibility of the analysis. These files provide structured information on country classifications, clustering schemes, metadata, and model-specific caveats.</w:t>
+      </w:r>
+    </w:p>
+    <w:p>
+      <w:pPr>
+        <w:spacing w:after="0"/>
+        <w:rPr>
+          <w:rFonts w:ascii="Calibri" w:hAnsi="Calibri" w:cs="Calibri"/>
+          <w:szCs w:val="21"/>
+        </w:rPr>
+      </w:pPr>
+    </w:p>
+    <w:p>
+      <w:pPr>
+        <w:spacing w:after="0"/>
+        <w:rPr>
+          <w:rFonts w:ascii="Calibri" w:hAnsi="Calibri" w:cs="Calibri"/>
+          <w:szCs w:val="21"/>
+        </w:rPr>
+      </w:pPr>
+      <w:r>
+        <w:rPr>
+          <w:rFonts w:ascii="Calibri" w:hAnsi="Calibri" w:cs="Calibri"/>
+          <w:szCs w:val="21"/>
+        </w:rPr>
+        <w:t>In particular, the metadata table documents variable definitions, sources, and transformations; the country table and clustering tables define regional and structural groupings used in the graphical analysis; and the model-specific caveat tables summarize known limitations or interpretative notes for each specification. These files are not directly used in the estimation procedures, but serve as documentation tools to ensure clarity and consistency throughout the project.</w:t>
+      </w:r>
+    </w:p>
+    <w:p>
+      <w:pPr>
+        <w:spacing w:after="0"/>
+        <w:rPr>
+          <w:rFonts w:ascii="Calibri" w:hAnsi="Calibri" w:cs="Calibri"/>
+          <w:szCs w:val="21"/>
+        </w:rPr>
+      </w:pPr>
+    </w:p>
+    <w:p>
+      <w:pPr>
+        <w:pStyle w:val="Heading1"/>
+        <w:spacing w:before="0"/>
+        <w:rPr>
+          <w:rFonts w:ascii="Calibri" w:hAnsi="Calibri" w:cs="Calibri"/>
+        </w:rPr>
+      </w:pPr>
+      <w:r>
+        <w:rPr>
+          <w:rFonts w:ascii="Calibri" w:hAnsi="Calibri" w:cs="Calibri"/>
           <w:color w:val="203864"/>
         </w:rPr>
-        <w:t xml:space="preserve"> explanation</w:t>
+        <w:t xml:space="preserve">7. </w:t>
+      </w:r>
+      <w:r>
+        <w:rPr>
+          <w:rFonts w:ascii="Calibri" w:hAnsi="Calibri" w:cs="Calibri"/>
+          <w:color w:val="203864"/>
+        </w:rPr>
+        <w:t xml:space="preserve">Empirical </w:t>
+      </w:r>
+      <w:r>
+        <w:rPr>
+          <w:rFonts w:ascii="Calibri" w:hAnsi="Calibri" w:cs="Calibri"/>
+          <w:color w:val="203864"/>
+        </w:rPr>
+        <w:t>P</w:t>
+      </w:r>
+      <w:r>
+        <w:rPr>
+          <w:rFonts w:ascii="Calibri" w:hAnsi="Calibri" w:cs="Calibri"/>
+          <w:color w:val="203864"/>
+        </w:rPr>
+        <w:t>ipeline and</w:t>
+      </w:r>
+      <w:r>
+        <w:rPr>
+          <w:rFonts w:ascii="Calibri" w:hAnsi="Calibri" w:cs="Calibri"/>
+          <w:color w:val="203864"/>
+        </w:rPr>
+        <w:t xml:space="preserve"> </w:t>
+      </w:r>
+      <w:r>
+        <w:rPr>
+          <w:rFonts w:ascii="Calibri" w:hAnsi="Calibri" w:cs="Calibri"/>
+          <w:color w:val="203864"/>
+        </w:rPr>
+        <w:t>E</w:t>
+      </w:r>
+      <w:r>
+        <w:rPr>
+          <w:rFonts w:ascii="Calibri" w:hAnsi="Calibri" w:cs="Calibri"/>
+          <w:color w:val="203864"/>
+        </w:rPr>
+        <w:t>xplanation</w:t>
       </w:r>
     </w:p>
     <w:p>
@@ -6776,15 +7037,7 @@
           <w:bCs/>
           <w:szCs w:val="21"/>
         </w:rPr>
-        <w:t>the Model 1 dataset in European CSV format (separator ; and decimal mark ,)</w:t>
-      </w:r>
-      <w:r>
-        <w:rPr>
-          <w:rFonts w:ascii="Calibri" w:hAnsi="Calibri" w:cs="Calibri"/>
-          <w:bCs/>
-          <w:szCs w:val="21"/>
-        </w:rPr>
-        <w:t xml:space="preserve"> is imported</w:t>
+        <w:t>The datasets are imported from CSV files (Model 1, Model 2, and world sample)</w:t>
       </w:r>
       <w:r>
         <w:rPr>
@@ -6842,82 +7095,103 @@
     </w:p>
     <w:p>
       <w:pPr>
-        <w:spacing w:after="0"/>
-        <w:rPr>
-          <w:rFonts w:ascii="Calibri" w:hAnsi="Calibri" w:cs="Calibri"/>
+        <w:pStyle w:val="Heading2"/>
+        <w:rPr>
+          <w:rFonts w:ascii="Calibri" w:eastAsiaTheme="minorEastAsia" w:hAnsi="Calibri" w:cs="Calibri"/>
+          <w:b w:val="0"/>
+          <w:color w:val="auto"/>
+          <w:sz w:val="21"/>
           <w:szCs w:val="21"/>
         </w:rPr>
       </w:pPr>
       <w:r>
         <w:rPr>
-          <w:rFonts w:ascii="Calibri" w:hAnsi="Calibri" w:cs="Calibri"/>
-          <w:bCs/>
+          <w:rFonts w:ascii="Calibri" w:eastAsiaTheme="minorEastAsia" w:hAnsi="Calibri" w:cs="Calibri"/>
+          <w:b w:val="0"/>
+          <w:color w:val="auto"/>
+          <w:sz w:val="21"/>
           <w:szCs w:val="21"/>
         </w:rPr>
-        <w:t>T</w:t>
-      </w:r>
-      <w:r>
-        <w:rPr>
-          <w:rFonts w:ascii="Calibri" w:hAnsi="Calibri" w:cs="Calibri"/>
-          <w:bCs/>
-          <w:szCs w:val="21"/>
-        </w:rPr>
-        <w:t xml:space="preserve">he variables </w:t>
-      </w:r>
-      <w:r>
-        <w:rPr>
-          <w:rFonts w:ascii="Calibri" w:hAnsi="Calibri" w:cs="Calibri"/>
-          <w:bCs/>
-          <w:szCs w:val="21"/>
-        </w:rPr>
-        <w:t xml:space="preserve">is renamed </w:t>
-      </w:r>
-      <w:r>
-        <w:rPr>
-          <w:rFonts w:ascii="Calibri" w:hAnsi="Calibri" w:cs="Calibri"/>
-          <w:bCs/>
-          <w:szCs w:val="21"/>
-        </w:rPr>
-        <w:t xml:space="preserve">with short, manageable labels. It also </w:t>
-      </w:r>
-      <w:r>
-        <w:rPr>
-          <w:rFonts w:ascii="Calibri" w:hAnsi="Calibri" w:cs="Calibri"/>
-          <w:bCs/>
-          <w:szCs w:val="21"/>
-        </w:rPr>
-        <w:t xml:space="preserve">is </w:t>
-      </w:r>
-      <w:r>
-        <w:rPr>
-          <w:rFonts w:ascii="Calibri" w:hAnsi="Calibri" w:cs="Calibri"/>
-          <w:bCs/>
-          <w:szCs w:val="21"/>
-        </w:rPr>
-        <w:t>create</w:t>
-      </w:r>
-      <w:r>
-        <w:rPr>
-          <w:rFonts w:ascii="Calibri" w:hAnsi="Calibri" w:cs="Calibri"/>
-          <w:bCs/>
-          <w:szCs w:val="21"/>
-        </w:rPr>
-        <w:t>d</w:t>
-      </w:r>
-      <w:r>
-        <w:rPr>
-          <w:rFonts w:ascii="Calibri" w:hAnsi="Calibri" w:cs="Calibri"/>
-          <w:bCs/>
-          <w:szCs w:val="21"/>
-        </w:rPr>
-        <w:t xml:space="preserve"> a numeric subset for correlations and regressions and three numeric vectors to be used as colors in plots clustered by growth model, region, and institutional stability.</w:t>
+        <w:t>Variables are renamed using short and manageable labels. A numeric subset is then constructed for correlation analysis and regression estimation, together with clustering vectors.</w:t>
       </w:r>
     </w:p>
     <w:p>
       <w:pPr>
-        <w:spacing w:after="0"/>
-        <w:rPr>
-          <w:rFonts w:ascii="Calibri" w:hAnsi="Calibri" w:cs="Calibri"/>
+        <w:pStyle w:val="Heading2"/>
+        <w:rPr>
+          <w:rFonts w:ascii="Calibri" w:eastAsiaTheme="minorEastAsia" w:hAnsi="Calibri" w:cs="Calibri"/>
+          <w:b w:val="0"/>
+          <w:color w:val="auto"/>
+          <w:sz w:val="21"/>
+          <w:szCs w:val="21"/>
+        </w:rPr>
+      </w:pPr>
+      <w:r>
+        <w:rPr>
+          <w:rFonts w:ascii="Calibri" w:eastAsiaTheme="minorEastAsia" w:hAnsi="Calibri" w:cs="Calibri"/>
+          <w:b w:val="0"/>
+          <w:color w:val="auto"/>
+          <w:sz w:val="21"/>
+          <w:szCs w:val="21"/>
+        </w:rPr>
+        <w:t>Clustering variables differ across datasets:</w:t>
+      </w:r>
+    </w:p>
+    <w:p>
+      <w:pPr>
+        <w:pStyle w:val="Heading2"/>
+        <w:spacing w:before="0"/>
+        <w:rPr>
+          <w:rFonts w:ascii="Calibri" w:eastAsiaTheme="minorEastAsia" w:hAnsi="Calibri" w:cs="Calibri"/>
+          <w:b w:val="0"/>
+          <w:color w:val="auto"/>
+          <w:sz w:val="21"/>
+          <w:szCs w:val="21"/>
+        </w:rPr>
+      </w:pPr>
+      <w:r>
+        <w:rPr>
+          <w:rFonts w:ascii="Calibri" w:eastAsiaTheme="minorEastAsia" w:hAnsi="Calibri" w:cs="Calibri"/>
+          <w:b w:val="0"/>
+          <w:color w:val="auto"/>
+          <w:sz w:val="21"/>
+          <w:szCs w:val="21"/>
+        </w:rPr>
+        <w:t>- Model 1 and Model 2 use region, core growth model, and institutional stability.</w:t>
+      </w:r>
+    </w:p>
+    <w:p>
+      <w:pPr>
+        <w:pStyle w:val="Heading2"/>
+        <w:spacing w:before="0"/>
+        <w:rPr>
+          <w:rFonts w:ascii="Calibri" w:eastAsiaTheme="minorEastAsia" w:hAnsi="Calibri" w:cs="Calibri"/>
+          <w:b w:val="0"/>
+          <w:color w:val="auto"/>
+          <w:sz w:val="21"/>
+          <w:szCs w:val="21"/>
+        </w:rPr>
+      </w:pPr>
+      <w:r>
+        <w:rPr>
+          <w:rFonts w:ascii="Calibri" w:eastAsiaTheme="minorEastAsia" w:hAnsi="Calibri" w:cs="Calibri"/>
+          <w:b w:val="0"/>
+          <w:color w:val="auto"/>
+          <w:sz w:val="21"/>
+          <w:szCs w:val="21"/>
+        </w:rPr>
+        <w:t>- The world sample uses region and a broader cluster classification.</w:t>
+      </w:r>
+    </w:p>
+    <w:p>
+      <w:pPr>
+        <w:pStyle w:val="Heading2"/>
+        <w:spacing w:before="0"/>
+        <w:rPr>
+          <w:rFonts w:ascii="Calibri" w:eastAsiaTheme="minorEastAsia" w:hAnsi="Calibri" w:cs="Calibri"/>
+          <w:b w:val="0"/>
+          <w:color w:val="auto"/>
+          <w:sz w:val="21"/>
           <w:szCs w:val="21"/>
         </w:rPr>
       </w:pPr>
@@ -6972,7 +7246,23 @@
           <w:bCs/>
           <w:szCs w:val="21"/>
         </w:rPr>
-        <w:t>and then some selected pairwise correlations. The full matrix is used to avoid cherry-picking; the selected correlations are used to guide scatter plots and regressions according to the three theoretical blocks: institutions, structure, and resource curse.</w:t>
+        <w:t xml:space="preserve">and then some selected pairwise correlations. The full matrix is used to avoid cherry-picking; the selected correlations are used to guide scatter plots and regressions according to the three theoretical blocks: </w:t>
+      </w:r>
+      <w:r>
+        <w:rPr>
+          <w:rFonts w:ascii="Calibri" w:hAnsi="Calibri" w:cs="Calibri"/>
+          <w:bCs/>
+          <w:szCs w:val="21"/>
+        </w:rPr>
+        <w:t>governance</w:t>
+      </w:r>
+      <w:r>
+        <w:rPr>
+          <w:rFonts w:ascii="Calibri" w:hAnsi="Calibri" w:cs="Calibri"/>
+          <w:bCs/>
+          <w:szCs w:val="21"/>
+        </w:rPr>
+        <w:t>, structure, and resource curse.</w:t>
       </w:r>
     </w:p>
     <w:p>
@@ -7001,7 +7291,6 @@
           <w:sz w:val="25"/>
           <w:szCs w:val="25"/>
         </w:rPr>
-        <w:lastRenderedPageBreak/>
         <w:t>Step 4 — Scatter Plot Diagnostics</w:t>
       </w:r>
     </w:p>
@@ -7010,35 +7299,17 @@
         <w:spacing w:after="0"/>
         <w:rPr>
           <w:rFonts w:ascii="Calibri" w:hAnsi="Calibri" w:cs="Calibri"/>
-          <w:szCs w:val="21"/>
-        </w:rPr>
-      </w:pPr>
-      <w:r>
-        <w:rPr>
-          <w:rFonts w:ascii="Calibri" w:hAnsi="Calibri" w:cs="Calibri"/>
           <w:bCs/>
           <w:szCs w:val="21"/>
-          <w:highlight w:val="yellow"/>
-        </w:rPr>
-        <w:t>Us</w:t>
-      </w:r>
+        </w:rPr>
+      </w:pPr>
       <w:r>
         <w:rPr>
           <w:rFonts w:ascii="Calibri" w:hAnsi="Calibri" w:cs="Calibri"/>
           <w:bCs/>
           <w:szCs w:val="21"/>
-          <w:highlight w:val="yellow"/>
-        </w:rPr>
-        <w:t xml:space="preserve">age of </w:t>
-      </w:r>
-      <w:r>
-        <w:rPr>
-          <w:rFonts w:ascii="Calibri" w:hAnsi="Calibri" w:cs="Calibri"/>
-          <w:bCs/>
-          <w:szCs w:val="21"/>
-          <w:highlight w:val="yellow"/>
-        </w:rPr>
-        <w:t>country code as the label, short names on the axes, and a long title with year and unit of measure. The dev.new() command opens a new graphics device, so each scatter plot remains separate and does not overwrite the previous one. There is no need to generate three versions for every pair if they do not add information: the criterion is theoretical, not mechanical.</w:t>
+        </w:rPr>
+        <w:t>Country codes are used as point labels, while axes are reported using short variable names and titles include full definitions with units and reference years. Each scatter plot is generated separately to preserve clarity. The selection of plotted relationships follows theoretical relevance rather than a mechanical enumeration of all possible variable pairs.</w:t>
       </w:r>
     </w:p>
     <w:p>
@@ -7075,6 +7346,7 @@
         <w:spacing w:after="0"/>
         <w:rPr>
           <w:rFonts w:ascii="Calibri" w:hAnsi="Calibri" w:cs="Calibri"/>
+          <w:bCs/>
           <w:szCs w:val="21"/>
         </w:rPr>
       </w:pPr>
@@ -7091,9 +7363,8 @@
           <w:rFonts w:ascii="Calibri" w:hAnsi="Calibri" w:cs="Calibri"/>
           <w:bCs/>
           <w:szCs w:val="21"/>
-          <w:highlight w:val="yellow"/>
-        </w:rPr>
-        <w:t>Here you look above all for the sign of the coefficients, economic plausibility, significance, and overall model stability.</w:t>
+        </w:rPr>
+        <w:t>Interpretation focuses primarily on the sign of coefficients, economic plausibility, statistical significance, and overall model stability.</w:t>
       </w:r>
     </w:p>
     <w:p>
@@ -7122,6 +7393,7 @@
           <w:sz w:val="25"/>
           <w:szCs w:val="25"/>
         </w:rPr>
+        <w:lastRenderedPageBreak/>
         <w:t>Step 6 — Structure of the Economy Models</w:t>
       </w:r>
     </w:p>
@@ -7312,15 +7584,7 @@
           <w:bCs/>
           <w:szCs w:val="21"/>
         </w:rPr>
-        <w:t>The first</w:t>
-      </w:r>
-      <w:r>
-        <w:rPr>
-          <w:rFonts w:ascii="Calibri" w:hAnsi="Calibri" w:cs="Calibri"/>
-          <w:bCs/>
-          <w:szCs w:val="21"/>
-        </w:rPr>
-        <w:t xml:space="preserve"> robustness check is often simple but important: how many observations does each model use? Then you can run targeted checks on outliers. If the key coefficient changes completely when removing a single country, the result should be reported with caution.</w:t>
+        <w:t>The first robustness check is often simple but important: how many observations does each model use? Then you can run targeted checks on outliers. If the key coefficient changes completely when removing a single country, the result should be reported with caution.</w:t>
       </w:r>
     </w:p>
     <w:p>
@@ -7432,15 +7696,7 @@
           <w:bCs/>
           <w:szCs w:val="21"/>
         </w:rPr>
-        <w:t>For the</w:t>
-      </w:r>
-      <w:r>
-        <w:rPr>
-          <w:rFonts w:ascii="Calibri" w:hAnsi="Calibri" w:cs="Calibri"/>
-          <w:bCs/>
-          <w:szCs w:val="21"/>
-        </w:rPr>
-        <w:t xml:space="preserve"> growth model, at least in the initial phase, a baseline is sufficient. The regressors are averages of levels and the dependent variable is GDP per capita growth. The logic here is much more parsimonious than in Model 1, precisely to avoid over-specifying before seeing the results.</w:t>
+        <w:t>For the growth model, at least in the initial phase, a baseline is sufficient. The regressors are averages of levels and the dependent variable is GDP per capita growth. The logic here is much more parsimonious than in Model 1, precisely to avoid over-specifying before seeing the results.</w:t>
       </w:r>
     </w:p>
     <w:p>
@@ -7465,15 +7721,59 @@
           <w:rFonts w:ascii="Calibri" w:hAnsi="Calibri" w:cs="Calibri"/>
           <w:color w:val="203864"/>
         </w:rPr>
-        <w:t>8</w:t>
+        <w:t xml:space="preserve">8. </w:t>
+      </w:r>
+      <w:bookmarkStart w:id="0" w:name="OLE_LINK3"/>
+      <w:r>
+        <w:rPr>
+          <w:rFonts w:ascii="Calibri" w:hAnsi="Calibri" w:cs="Calibri"/>
+          <w:color w:val="203864"/>
+        </w:rPr>
+        <w:t xml:space="preserve">How to </w:t>
       </w:r>
       <w:r>
         <w:rPr>
           <w:rFonts w:ascii="Calibri" w:hAnsi="Calibri" w:cs="Calibri"/>
           <w:color w:val="203864"/>
         </w:rPr>
-        <w:t>. How to read the regression output once you run it</w:t>
+        <w:t>Interpret</w:t>
       </w:r>
+      <w:r>
+        <w:rPr>
+          <w:rFonts w:ascii="Calibri" w:hAnsi="Calibri" w:cs="Calibri"/>
+          <w:color w:val="203864"/>
+        </w:rPr>
+        <w:t xml:space="preserve"> the </w:t>
+      </w:r>
+      <w:r>
+        <w:rPr>
+          <w:rFonts w:ascii="Calibri" w:hAnsi="Calibri" w:cs="Calibri"/>
+          <w:color w:val="203864"/>
+        </w:rPr>
+        <w:t>R</w:t>
+      </w:r>
+      <w:r>
+        <w:rPr>
+          <w:rFonts w:ascii="Calibri" w:hAnsi="Calibri" w:cs="Calibri"/>
+          <w:color w:val="203864"/>
+        </w:rPr>
+        <w:t xml:space="preserve">egression </w:t>
+      </w:r>
+      <w:r>
+        <w:rPr>
+          <w:rFonts w:ascii="Calibri" w:hAnsi="Calibri" w:cs="Calibri"/>
+          <w:color w:val="203864"/>
+        </w:rPr>
+        <w:t>O</w:t>
+      </w:r>
+      <w:r>
+        <w:rPr>
+          <w:rFonts w:ascii="Calibri" w:hAnsi="Calibri" w:cs="Calibri"/>
+          <w:color w:val="203864"/>
+        </w:rPr>
+        <w:t>utput</w:t>
+      </w:r>
+      <w:bookmarkEnd w:id="0"/>
     </w:p>
     <w:p>
       <w:pPr>
@@ -7534,7 +7834,6 @@
           <w:b/>
           <w:szCs w:val="21"/>
         </w:rPr>
-        <w:lastRenderedPageBreak/>
         <w:t xml:space="preserve">Std. Error: </w:t>
       </w:r>
       <w:r>
@@ -7602,15 +7901,7 @@
           <w:bCs/>
           <w:szCs w:val="21"/>
         </w:rPr>
-        <w:t>They are used to assess the statistical significance of the coefficient under the null hypothesis that the coefficient is equal to zero</w:t>
-      </w:r>
-      <w:r>
-        <w:rPr>
-          <w:rFonts w:ascii="Calibri" w:hAnsi="Calibri" w:cs="Calibri"/>
-          <w:bCs/>
-          <w:szCs w:val="21"/>
-        </w:rPr>
-        <w:t>.</w:t>
+        <w:t>They are used to assess the statistical significance of the coefficient under the null hypothesis that the coefficient is equal to zero.</w:t>
       </w:r>
     </w:p>
     <w:p>

</xml_diff>